<commit_message>
Trực Quan Hóa Dữ Liệu
</commit_message>
<xml_diff>
--- a/docx/Bao_Cao_Lam_Sach_Va_Truc_Quan_Hoa_Du_Lieu.docx
+++ b/docx/Bao_Cao_Lam_Sach_Va_Truc_Quan_Hoa_Du_Lieu.docx
@@ -12,9 +12,19 @@
           <w:rFonts w:ascii="Calibri" w:hAnsi="Calibri"/>
           <w:b/>
           <w:color w:val="124066"/>
-          <w:sz w:val="33"/>
+          <w:sz w:val="34"/>
         </w:rPr>
-        <w:t>BÁO CÁO KỸ THUẬT: LÀM SẠCH, THẨM ĐỊNH &amp; KẾ HOẠCH TRỰC QUAN HÓA DỮ LIỆU CỬ CHỈ TAY</w:t>
+        <w:t>BÁO CÁO KỸ THUẬT TOÀN DIỆN:</w:t>
+      </w:r>
+      <w:r>
+        <w:rPr>
+          <w:rFonts w:ascii="Calibri" w:hAnsi="Calibri"/>
+          <w:b/>
+          <w:color w:val="124066"/>
+          <w:sz w:val="34"/>
+        </w:rPr>
+        <w:br/>
+        <w:t>QUY TRÌNH LÀM SẠCH, KIỂM ĐỊNH &amp; TRỰC QUAN HÓA DỮ LIỆU CỬ CHỈ TAY</w:t>
       </w:r>
     </w:p>
     <w:p>
@@ -28,7 +38,7 @@
           <w:i/>
           <w:color w:val="1F6EA5"/>
         </w:rPr>
-        <w:t>Dự Án: Nhận Diện Cử Chỉ Tay Thuyết Trình Slide (Zoom, Vuốt, Con Trỏ Không Gian)</w:t>
+        <w:t>Dự Án: Nhận Diện Cử Chỉ Tay Ứng Dụng Trong Thuyết Trình Slide (Zoom, Vuốt, Con Trỏ Không Gian)</w:t>
       </w:r>
       <w:r>
         <w:rPr>
@@ -37,7 +47,7 @@
           <w:color w:val="1F6EA5"/>
         </w:rPr>
         <w:br/>
-        <w:t>Bộ Dữ Liệu 26.768 Mẫu Ultralytics Hand-Keypoints (21 Điểm Mấu Chốt)</w:t>
+        <w:t>Bộ Dữ Liệu 26.768 Mẫu Ultralytics Hand-Keypoints (21 Điểm Mấu Chốt 2D/3D)</w:t>
       </w:r>
     </w:p>
     <w:tbl>
@@ -162,7 +172,7 @@
         <w:tc>
           <w:tcPr>
             <w:tcW w:w="4896" w:type="dxa"/>
-            <w:shd w:val="clear" w:color="auto" w:fill="EBF5FB"/>
+            <w:shd w:val="clear" w:color="auto" w:fill="EAFAF1"/>
             <w:tcMar>
               <w:top w:w="70" w:type="dxa"/>
               <w:left w:w="100" w:type="dxa"/>
@@ -180,16 +190,16 @@
                 <w:b/>
                 <w:sz w:val="19"/>
               </w:rPr>
-              <w:t xml:space="preserve">Trọng tâm Bước 2 (Trực quan hóa): </w:t>
+              <w:t xml:space="preserve">Trạng thái Bước 2 (Trực quan hóa): </w:t>
             </w:r>
             <w:r>
               <w:rPr>
                 <w:rFonts w:ascii="Calibri" w:hAnsi="Calibri"/>
                 <w:b/>
-                <w:color w:val="124066"/>
+                <w:color w:val="1E823C"/>
                 <w:sz w:val="19"/>
               </w:rPr>
-              <w:t>Vẽ Phân Bố Thống Kê &amp; Lưới Khung Xương 21 Điểm</w:t>
+              <w:t>⭐ ĐÃ HOÀN THÀNH XUẤT BẢN 4 BỘ BIỂU ĐỒ 300 DPI</w:t>
             </w:r>
           </w:p>
         </w:tc>
@@ -203,7 +213,7 @@
     <w:p>
       <w:pPr>
         <w:keepNext/>
-        <w:spacing w:before="260" w:after="80"/>
+        <w:spacing w:before="280" w:after="100"/>
       </w:pPr>
       <w:r>
         <w:rPr>
@@ -218,7 +228,7 @@
     <w:p>
       <w:pPr>
         <w:keepNext/>
-        <w:spacing w:before="180" w:after="60"/>
+        <w:spacing w:before="200" w:after="60"/>
       </w:pPr>
       <w:r>
         <w:rPr>
@@ -239,7 +249,7 @@
           <w:color w:val="28323C"/>
           <w:sz w:val="20"/>
         </w:rPr>
-        <w:t>Thư mục data/hand-keypoints hiện đang lưu trữ tập dữ liệu chuẩn YOLO Pose gồm 2 tập chính:</w:t>
+        <w:t>Thư mục data/hand-keypoints đang lưu trữ tập dữ liệu chuẩn YOLO Pose gồm 2 tập chính:</w:t>
       </w:r>
     </w:p>
     <w:p>
@@ -281,19 +291,29 @@
           <w:color w:val="28323C"/>
           <w:sz w:val="19"/>
         </w:rPr>
-        <w:t>Tổng cộng: 26.768 cặp mẫu. Mỗi ảnh chứa đúng 1 bàn tay đã được gán nhãn 21 điểm mấu chốt giải phẫu học.</w:t>
+        <w:t xml:space="preserve">Tổng cộng: 26.768 cặp mẫu. Mỗi ảnh chứa đúng 1 bàn tay đã được gán nhãn 21 điểm mấu chốt giải phẫu học, bao gồm cả bàn tay trái và bàn tay phải ở </w:t>
+      </w:r>
+      <w:r>
+        <w:rPr>
+          <w:rFonts w:ascii="Calibri" w:hAnsi="Calibri"/>
+          <w:color w:val="28323C"/>
+          <w:sz w:val="20"/>
+        </w:rPr>
+        <w:t xml:space="preserve">hiện </w:t>
+      </w:r>
+      <w:r>
+        <w:rPr>
+          <w:rFonts w:ascii="Calibri" w:hAnsi="Calibri"/>
+          <w:color w:val="28323C"/>
+          <w:sz w:val="19"/>
+        </w:rPr>
+        <w:t>tỉ lệ cân bằng xấp xỉ 50/50.</w:t>
       </w:r>
     </w:p>
     <w:p>
       <w:pPr>
         <w:keepNext/>
-        <w:spacing w:before="180" w:after="60"/>
-        <w:rPr>
-          <w:rFonts w:ascii="Calibri" w:hAnsi="Calibri"/>
-          <w:b/>
-          <w:color w:val="1F6EA5"/>
-          <w:lang w:val="vi-VN"/>
-        </w:rPr>
+        <w:spacing w:before="200" w:after="60"/>
       </w:pPr>
       <w:r>
         <w:rPr>
@@ -306,124 +326,84 @@
     </w:p>
     <w:p>
       <w:pPr>
-        <w:keepNext/>
-        <w:spacing w:before="180" w:after="60"/>
-        <w:rPr>
-          <w:lang w:val="vi-VN"/>
-        </w:rPr>
+        <w:spacing w:after="70"/>
       </w:pPr>
       <w:r>
         <w:rPr>
-          <w:noProof/>
-          <w:lang w:val="vi-VN"/>
+          <w:rFonts w:ascii="Calibri" w:hAnsi="Calibri"/>
+          <w:color w:val="28323C"/>
+          <w:sz w:val="20"/>
         </w:rPr>
-        <w:drawing>
-          <wp:inline distT="0" distB="0" distL="0" distR="0" wp14:anchorId="3DE46064" wp14:editId="5B563FD2">
-            <wp:extent cx="6217920" cy="2167890"/>
-            <wp:effectExtent l="0" t="0" r="0" b="3810"/>
-            <wp:docPr id="1660295747" name="Picture 1"/>
-            <wp:cNvGraphicFramePr>
-              <a:graphicFrameLocks xmlns:a="http://schemas.openxmlformats.org/drawingml/2006/main" noChangeAspect="1"/>
-            </wp:cNvGraphicFramePr>
-            <a:graphic xmlns:a="http://schemas.openxmlformats.org/drawingml/2006/main">
-              <a:graphicData uri="http://schemas.openxmlformats.org/drawingml/2006/picture">
-                <pic:pic xmlns:pic="http://schemas.openxmlformats.org/drawingml/2006/picture">
-                  <pic:nvPicPr>
-                    <pic:cNvPr id="1660295747" name="Picture 1660295747"/>
-                    <pic:cNvPicPr/>
-                  </pic:nvPicPr>
-                  <pic:blipFill>
-                    <a:blip r:embed="rId6"/>
-                    <a:stretch>
-                      <a:fillRect/>
-                    </a:stretch>
-                  </pic:blipFill>
-                  <pic:spPr>
-                    <a:xfrm>
-                      <a:off x="0" y="0"/>
-                      <a:ext cx="6217920" cy="2167890"/>
-                    </a:xfrm>
-                    <a:prstGeom prst="rect">
-                      <a:avLst/>
-                    </a:prstGeom>
-                  </pic:spPr>
-                </pic:pic>
-              </a:graphicData>
-            </a:graphic>
-          </wp:inline>
-        </w:drawing>
+        <w:t>Bộ dữ liệu 21 điểm mấu chốt chính là 'bộ gen hình học' của mọi cử chỉ không gian:</w:t>
       </w:r>
     </w:p>
     <w:p>
       <w:pPr>
         <w:pStyle w:val="ListBullet"/>
         <w:spacing w:after="50"/>
-        <w:rPr>
-          <w:lang w:val="vi-VN"/>
-        </w:rPr>
       </w:pPr>
       <w:r>
         <w:rPr>
           <w:rFonts w:ascii="Calibri" w:hAnsi="Calibri"/>
           <w:color w:val="28323C"/>
           <w:sz w:val="19"/>
-          <w:lang w:val="vi-VN"/>
         </w:rPr>
-        <w:t>Thao tác Con trỏ không gian (Air Cursor): Dựa trên vector chỉ hướng và tọa độ đỉnh ngón trỏ (Keypoint 8: Index TIP) tương đối so với khớp đốt ngón (Keypoint 5, 6, 7).</w:t>
+        <w:t>Thao tác Con trỏ không gian (Air Cursor): Dựa trên vector chỉ hướng và tọa độ đỉnh ngón trỏ (Keypoint số 8: Index TIP) tương đối so với khớp đốt ngón (Keypoint số 5, 6, 7).</w:t>
       </w:r>
     </w:p>
     <w:p>
       <w:pPr>
         <w:pStyle w:val="ListBullet"/>
         <w:spacing w:after="50"/>
-        <w:rPr>
-          <w:lang w:val="vi-VN"/>
-        </w:rPr>
       </w:pPr>
       <w:r>
         <w:rPr>
           <w:rFonts w:ascii="Calibri" w:hAnsi="Calibri"/>
           <w:color w:val="28323C"/>
           <w:sz w:val="19"/>
-          <w:lang w:val="vi-VN"/>
         </w:rPr>
-        <w:t>Thao tác Zoom không gian (Pinch Zoom): Dựa trên khoảng cách Euclid giữa đầu ngón cái (Keypoint 4: Thumb TIP) và đầu ngón trỏ (Keypoint 8: Index TIP).</w:t>
+        <w:t>Thao tác Zoom không gian (Pinch Zoom): Dựa trên khoảng cách Euclid giữa đầu ngón cái (Keypoint 4: Thumb TIP) và đầu ngón trỏ (Keypoint 8: Index TIP). Nếu dữ liệu nhãn bị lệch vị trí 2 điểm này, ngưỡng nhận diện zoom sẽ bị sai hoàn toàn.</w:t>
       </w:r>
     </w:p>
     <w:p>
       <w:pPr>
         <w:pStyle w:val="ListBullet"/>
         <w:spacing w:after="50"/>
-        <w:rPr>
-          <w:lang w:val="vi-VN"/>
-        </w:rPr>
       </w:pPr>
       <w:r>
         <w:rPr>
           <w:rFonts w:ascii="Calibri" w:hAnsi="Calibri"/>
           <w:color w:val="28323C"/>
           <w:sz w:val="19"/>
-          <w:lang w:val="vi-VN"/>
         </w:rPr>
-        <w:t>Thao tác Vuốt (Dynamic Swipe): Dựa trên vị trí tâm cổ tay (Keypoint 0) hoặc gốc ngón giữa (Keypoint 9) theo dõi đạo hàm vận tốc vx = dx/dt trên cửa sổ thời gian.</w:t>
+        <w:t>Thao tác Vuốt (Swipe): Dựa trên vị trí tâm bàn tay (Keypoint 0 hoặc Keypoint 9). Muốn nhận diện chuyển động vuốt chuẩn, tọa độ các điểm mốc này phải có độ chính xác cao và không bị nhiễu biên.</w:t>
       </w:r>
     </w:p>
     <w:p>
       <w:pPr>
         <w:keepNext/>
-        <w:spacing w:before="180" w:after="60"/>
-        <w:rPr>
-          <w:lang w:val="vi-VN"/>
-        </w:rPr>
+        <w:spacing w:before="200" w:after="60"/>
       </w:pPr>
       <w:r>
         <w:rPr>
           <w:rFonts w:ascii="Calibri" w:hAnsi="Calibri"/>
           <w:b/>
           <w:color w:val="1F6EA5"/>
-          <w:lang w:val="vi-VN"/>
         </w:rPr>
-        <w:t>1.3. Cấu trúc nhãn 68 tokens chuẩn xác (Label Schema)</w:t>
+        <w:t>1.3. Cấu trúc nhãn 68 tham số chi tiết (Label Schema)</w:t>
+      </w:r>
+    </w:p>
+    <w:p>
+      <w:pPr>
+        <w:spacing w:after="70"/>
+      </w:pPr>
+      <w:r>
+        <w:rPr>
+          <w:rFonts w:ascii="Calibri" w:hAnsi="Calibri"/>
+          <w:color w:val="28323C"/>
+          <w:sz w:val="20"/>
+        </w:rPr>
+        <w:t>Mỗi dòng trong file nhãn .txt chứa một chuỗi chính xác 68 số thực ngăn cách bởi dấu cách trắng:</w:t>
       </w:r>
     </w:p>
     <w:tbl>
@@ -469,7 +449,78 @@
                 <w:sz w:val="17"/>
               </w:rPr>
               <w:br/>
-              <w:t>Quy định: 1 Class ID (0) + 4 BBox (cx, cy, w, h) + 63 giá trị tọa độ và visibility của 21 khớp xương = 68 tokens.</w:t>
+            </w:r>
+            <w:r>
+              <w:rPr>
+                <w:rFonts w:ascii="Consolas" w:hAnsi="Consolas"/>
+                <w:color w:val="1E2D3C"/>
+                <w:sz w:val="17"/>
+              </w:rPr>
+              <w:br/>
+              <w:t>Quy định ý nghĩa từng phần tử:</w:t>
+            </w:r>
+            <w:r>
+              <w:rPr>
+                <w:rFonts w:ascii="Consolas" w:hAnsi="Consolas"/>
+                <w:color w:val="1E2D3C"/>
+                <w:sz w:val="17"/>
+              </w:rPr>
+              <w:br/>
+              <w:t>1. class_id: 1 số nguyên (luôn là 0 đại diện cho đối tượng 'hand').</w:t>
+            </w:r>
+            <w:r>
+              <w:rPr>
+                <w:rFonts w:ascii="Consolas" w:hAnsi="Consolas"/>
+                <w:color w:val="1E2D3C"/>
+                <w:sz w:val="17"/>
+              </w:rPr>
+              <w:br/>
+              <w:t>2. cx, cy: Tọa độ tâm của bounding box (chuẩn hóa trong khoảng [0.0, 1.0]).</w:t>
+            </w:r>
+            <w:r>
+              <w:rPr>
+                <w:rFonts w:ascii="Consolas" w:hAnsi="Consolas"/>
+                <w:color w:val="1E2D3C"/>
+                <w:sz w:val="17"/>
+              </w:rPr>
+              <w:br/>
+              <w:t>3. w, h: Chiều rộng và chiều cao tương đối của bounding box so với kích thước ảnh (224x224).</w:t>
+            </w:r>
+            <w:r>
+              <w:rPr>
+                <w:rFonts w:ascii="Consolas" w:hAnsi="Consolas"/>
+                <w:color w:val="1E2D3C"/>
+                <w:sz w:val="17"/>
+              </w:rPr>
+              <w:br/>
+              <w:t>4. 21 cụm (x_i, y_i, v_i) tương ứng với 21 khớp xương từ 0 đến 20:</w:t>
+            </w:r>
+            <w:r>
+              <w:rPr>
+                <w:rFonts w:ascii="Consolas" w:hAnsi="Consolas"/>
+                <w:color w:val="1E2D3C"/>
+                <w:sz w:val="17"/>
+              </w:rPr>
+              <w:br/>
+              <w:t xml:space="preserve">   - x_i, y_i: Tọa độ điểm mấu chốt được chuẩn hóa [0.0, 1.0].</w:t>
+            </w:r>
+            <w:r>
+              <w:rPr>
+                <w:rFonts w:ascii="Consolas" w:hAnsi="Consolas"/>
+                <w:color w:val="1E2D3C"/>
+                <w:sz w:val="17"/>
+              </w:rPr>
+              <w:br/>
+              <w:t xml:space="preserve">   - v_i: Trạng thái hiển thị (0: điểm ngoài khung ảnh, 1: bị ngón khác che khuất, 2: nhìn thấy rõ).</w:t>
+            </w:r>
+            <w:r>
+              <w:rPr>
+                <w:rFonts w:ascii="Consolas" w:hAnsi="Consolas"/>
+                <w:color w:val="1E2D3C"/>
+                <w:sz w:val="17"/>
+              </w:rPr>
+              <w:br/>
+              <w:t>=&gt; TỔNG CỘNG: 1 (class) + 4 (bbox) + 21 * 3 (keypoints) = 68 tokens.</w:t>
             </w:r>
           </w:p>
         </w:tc>
@@ -483,7 +534,7 @@
     <w:p>
       <w:pPr>
         <w:keepNext/>
-        <w:spacing w:before="260" w:after="80"/>
+        <w:spacing w:before="280" w:after="100"/>
       </w:pPr>
       <w:r>
         <w:rPr>
@@ -492,7 +543,8 @@
           <w:color w:val="124066"/>
           <w:sz w:val="26"/>
         </w:rPr>
-        <w:t>2. KẾT QUẢ THỰC NGHIỆM BƯỚC 1: LÀM SẠCH DỮ LIỆU ĐÃ ĐẠT ĐƯỢC</w:t>
+        <w:lastRenderedPageBreak/>
+        <w:t>2. QUY TRÌNH LÀM SẠCH VÀ KIỂM ĐỊNH DỮ LIỆU TOÀN DIỆN (DATA CLEANING PIPELINE)</w:t>
       </w:r>
     </w:p>
     <w:p>
@@ -505,8 +557,469 @@
           <w:color w:val="28323C"/>
           <w:sz w:val="20"/>
         </w:rPr>
-        <w:t>Quá trình thực thi script data_cleaner.py trên toàn bộ 26.768 mẫu đã mang lại kết quả kiểm toán xuất sắc:</w:t>
+        <w:t>Quy trình làm sạch được thiết kế gồm 4 tầng lọc kiểm tra nghiêm ngặt (Multi-stage Filtering Pipeline) trong tệp src/data_cleaner.py:</w:t>
       </w:r>
+    </w:p>
+    <w:tbl>
+      <w:tblPr>
+        <w:tblW w:w="0" w:type="auto"/>
+        <w:jc w:val="center"/>
+        <w:tblLook w:val="04A0" w:firstRow="1" w:lastRow="0" w:firstColumn="1" w:lastColumn="0" w:noHBand="0" w:noVBand="1"/>
+      </w:tblPr>
+      <w:tblGrid>
+        <w:gridCol w:w="6030"/>
+      </w:tblGrid>
+      <w:tr>
+        <w:trPr>
+          <w:jc w:val="center"/>
+        </w:trPr>
+        <w:tc>
+          <w:tcPr>
+            <w:tcW w:w="6030" w:type="dxa"/>
+            <w:shd w:val="clear" w:color="auto" w:fill="F8F9F9"/>
+            <w:tcMar>
+              <w:top w:w="70" w:type="dxa"/>
+              <w:left w:w="120" w:type="dxa"/>
+              <w:bottom w:w="70" w:type="dxa"/>
+              <w:right w:w="120" w:type="dxa"/>
+            </w:tcMar>
+          </w:tcPr>
+          <w:p>
+            <w:pPr>
+              <w:spacing w:after="0" w:line="264" w:lineRule="auto"/>
+            </w:pPr>
+            <w:r>
+              <w:rPr>
+                <w:rFonts w:ascii="Consolas" w:hAnsi="Consolas"/>
+                <w:color w:val="1E2D3C"/>
+                <w:sz w:val="17"/>
+              </w:rPr>
+              <w:t>[Bộ dữ liệu thô: 26.768 mẫu]</w:t>
+            </w:r>
+            <w:r>
+              <w:rPr>
+                <w:rFonts w:ascii="Consolas" w:hAnsi="Consolas"/>
+                <w:color w:val="1E2D3C"/>
+                <w:sz w:val="17"/>
+              </w:rPr>
+              <w:br/>
+              <w:t xml:space="preserve">           │</w:t>
+            </w:r>
+            <w:r>
+              <w:rPr>
+                <w:rFonts w:ascii="Consolas" w:hAnsi="Consolas"/>
+                <w:color w:val="1E2D3C"/>
+                <w:sz w:val="17"/>
+              </w:rPr>
+              <w:br/>
+              <w:t xml:space="preserve">           ▼</w:t>
+            </w:r>
+            <w:r>
+              <w:rPr>
+                <w:rFonts w:ascii="Consolas" w:hAnsi="Consolas"/>
+                <w:color w:val="1E2D3C"/>
+                <w:sz w:val="17"/>
+              </w:rPr>
+              <w:br/>
+              <w:t>┌────────────────────────────────────────────────────────┐</w:t>
+            </w:r>
+            <w:r>
+              <w:rPr>
+                <w:rFonts w:ascii="Consolas" w:hAnsi="Consolas"/>
+                <w:color w:val="1E2D3C"/>
+                <w:sz w:val="17"/>
+              </w:rPr>
+              <w:br/>
+              <w:t>│ TẦNG 1: KIỂM TRA TOÀN VẸN TỆP TIN (FILE INTEGRITY)     │</w:t>
+            </w:r>
+            <w:r>
+              <w:rPr>
+                <w:rFonts w:ascii="Consolas" w:hAnsi="Consolas"/>
+                <w:color w:val="1E2D3C"/>
+                <w:sz w:val="17"/>
+              </w:rPr>
+              <w:br/>
+              <w:t>│ 1.1 Kiểm tra file ảnh hỏng (Corrupted JPEG Header)    │</w:t>
+            </w:r>
+            <w:r>
+              <w:rPr>
+                <w:rFonts w:ascii="Consolas" w:hAnsi="Consolas"/>
+                <w:color w:val="1E2D3C"/>
+                <w:sz w:val="17"/>
+              </w:rPr>
+              <w:br/>
+              <w:t>│ 1.2 Kiểm tra lệch cặp ảnh - nhãn (Orphaned Files)     │</w:t>
+            </w:r>
+            <w:r>
+              <w:rPr>
+                <w:rFonts w:ascii="Consolas" w:hAnsi="Consolas"/>
+                <w:color w:val="1E2D3C"/>
+                <w:sz w:val="17"/>
+              </w:rPr>
+              <w:br/>
+              <w:t>│ 1.3 Kiểm tra dung lượng file rỗng (Zero-byte Files)    │</w:t>
+            </w:r>
+            <w:r>
+              <w:rPr>
+                <w:rFonts w:ascii="Consolas" w:hAnsi="Consolas"/>
+                <w:color w:val="1E2D3C"/>
+                <w:sz w:val="17"/>
+              </w:rPr>
+              <w:br/>
+              <w:t>└────────────────────────────────────────────────────────┘</w:t>
+            </w:r>
+            <w:r>
+              <w:rPr>
+                <w:rFonts w:ascii="Consolas" w:hAnsi="Consolas"/>
+                <w:color w:val="1E2D3C"/>
+                <w:sz w:val="17"/>
+              </w:rPr>
+              <w:br/>
+              <w:t xml:space="preserve">           │ (Loại bỏ các file hỏng vật lý)</w:t>
+            </w:r>
+            <w:r>
+              <w:rPr>
+                <w:rFonts w:ascii="Consolas" w:hAnsi="Consolas"/>
+                <w:color w:val="1E2D3C"/>
+                <w:sz w:val="17"/>
+              </w:rPr>
+              <w:br/>
+              <w:t xml:space="preserve">           ▼</w:t>
+            </w:r>
+            <w:r>
+              <w:rPr>
+                <w:rFonts w:ascii="Consolas" w:hAnsi="Consolas"/>
+                <w:color w:val="1E2D3C"/>
+                <w:sz w:val="17"/>
+              </w:rPr>
+              <w:br/>
+              <w:t>┌────────────────────────────────────────────────────────┐</w:t>
+            </w:r>
+            <w:r>
+              <w:rPr>
+                <w:rFonts w:ascii="Consolas" w:hAnsi="Consolas"/>
+                <w:color w:val="1E2D3C"/>
+                <w:sz w:val="17"/>
+              </w:rPr>
+              <w:br/>
+              <w:t>│ TẦNG 2: THẨM ĐỊNH CÚ PHÁP &amp; CẤU TRÚC NHÃN (SYNTAX)     │</w:t>
+            </w:r>
+            <w:r>
+              <w:rPr>
+                <w:rFonts w:ascii="Consolas" w:hAnsi="Consolas"/>
+                <w:color w:val="1E2D3C"/>
+                <w:sz w:val="17"/>
+              </w:rPr>
+              <w:br/>
+              <w:t>│ 2.1 Kiểm tra số lượng tokens mỗi dòng (Bắt buộc = 68)  │</w:t>
+            </w:r>
+            <w:r>
+              <w:rPr>
+                <w:rFonts w:ascii="Consolas" w:hAnsi="Consolas"/>
+                <w:color w:val="1E2D3C"/>
+                <w:sz w:val="17"/>
+              </w:rPr>
+              <w:br/>
+              <w:t>│ 2.2 Kiểm tra Class ID (Bắt buộc = 0)                   │</w:t>
+            </w:r>
+            <w:r>
+              <w:rPr>
+                <w:rFonts w:ascii="Consolas" w:hAnsi="Consolas"/>
+                <w:color w:val="1E2D3C"/>
+                <w:sz w:val="17"/>
+              </w:rPr>
+              <w:br/>
+              <w:t>│ 2.3 Kiểm tra kiểu dữ liệu float hợp lệ                │</w:t>
+            </w:r>
+            <w:r>
+              <w:rPr>
+                <w:rFonts w:ascii="Consolas" w:hAnsi="Consolas"/>
+                <w:color w:val="1E2D3C"/>
+                <w:sz w:val="17"/>
+              </w:rPr>
+              <w:br/>
+              <w:t>└────────────────────────────────────────────────────────┘</w:t>
+            </w:r>
+            <w:r>
+              <w:rPr>
+                <w:rFonts w:ascii="Consolas" w:hAnsi="Consolas"/>
+                <w:color w:val="1E2D3C"/>
+                <w:sz w:val="17"/>
+              </w:rPr>
+              <w:br/>
+              <w:t xml:space="preserve">           │ (Loại bỏ file nhãn sai format)</w:t>
+            </w:r>
+            <w:r>
+              <w:rPr>
+                <w:rFonts w:ascii="Consolas" w:hAnsi="Consolas"/>
+                <w:color w:val="1E2D3C"/>
+                <w:sz w:val="17"/>
+              </w:rPr>
+              <w:br/>
+              <w:t xml:space="preserve">           ▼</w:t>
+            </w:r>
+            <w:r>
+              <w:rPr>
+                <w:rFonts w:ascii="Consolas" w:hAnsi="Consolas"/>
+                <w:color w:val="1E2D3C"/>
+                <w:sz w:val="17"/>
+              </w:rPr>
+              <w:br/>
+              <w:t>┌────────────────────────────────────────────────────────┐</w:t>
+            </w:r>
+            <w:r>
+              <w:rPr>
+                <w:rFonts w:ascii="Consolas" w:hAnsi="Consolas"/>
+                <w:color w:val="1E2D3C"/>
+                <w:sz w:val="17"/>
+              </w:rPr>
+              <w:br/>
+              <w:t>│ TẦNG 3: THẨM ĐỊNH TỌA ĐỘ VÀ HÌNH HỌC (GEOMETRIC BOUNDS)│</w:t>
+            </w:r>
+            <w:r>
+              <w:rPr>
+                <w:rFonts w:ascii="Consolas" w:hAnsi="Consolas"/>
+                <w:color w:val="1E2D3C"/>
+                <w:sz w:val="17"/>
+              </w:rPr>
+              <w:br/>
+              <w:t>│ 3.1 Bounding box hợp lệ: w &gt; 0, h &gt; 0, cx+w/2, cy+h/2  │</w:t>
+            </w:r>
+            <w:r>
+              <w:rPr>
+                <w:rFonts w:ascii="Consolas" w:hAnsi="Consolas"/>
+                <w:color w:val="1E2D3C"/>
+                <w:sz w:val="17"/>
+              </w:rPr>
+              <w:br/>
+              <w:t>│ 3.2 Tọa độ Keypoint trong ngưỡng: 0.0 &lt;= x_i, y_i &lt;= 1.0│</w:t>
+            </w:r>
+            <w:r>
+              <w:rPr>
+                <w:rFonts w:ascii="Consolas" w:hAnsi="Consolas"/>
+                <w:color w:val="1E2D3C"/>
+                <w:sz w:val="17"/>
+              </w:rPr>
+              <w:br/>
+              <w:t>│ 3.3 Visibility hợp lệ: v_i in {0, 1, 2}                │</w:t>
+            </w:r>
+            <w:r>
+              <w:rPr>
+                <w:rFonts w:ascii="Consolas" w:hAnsi="Consolas"/>
+                <w:color w:val="1E2D3C"/>
+                <w:sz w:val="17"/>
+              </w:rPr>
+              <w:br/>
+              <w:t>└────────────────────────────────────────────────────────┘</w:t>
+            </w:r>
+            <w:r>
+              <w:rPr>
+                <w:rFonts w:ascii="Consolas" w:hAnsi="Consolas"/>
+                <w:color w:val="1E2D3C"/>
+                <w:sz w:val="17"/>
+              </w:rPr>
+              <w:br/>
+              <w:t xml:space="preserve">           │ (Loại bỏ mẫu trôi tọa độ ngoài ảnh)</w:t>
+            </w:r>
+            <w:r>
+              <w:rPr>
+                <w:rFonts w:ascii="Consolas" w:hAnsi="Consolas"/>
+                <w:color w:val="1E2D3C"/>
+                <w:sz w:val="17"/>
+              </w:rPr>
+              <w:br/>
+              <w:t xml:space="preserve">           ▼</w:t>
+            </w:r>
+            <w:r>
+              <w:rPr>
+                <w:rFonts w:ascii="Consolas" w:hAnsi="Consolas"/>
+                <w:color w:val="1E2D3C"/>
+                <w:sz w:val="17"/>
+              </w:rPr>
+              <w:br/>
+              <w:t>┌────────────────────────────────────────────────────────┐</w:t>
+            </w:r>
+            <w:r>
+              <w:rPr>
+                <w:rFonts w:ascii="Consolas" w:hAnsi="Consolas"/>
+                <w:color w:val="1E2D3C"/>
+                <w:sz w:val="17"/>
+              </w:rPr>
+              <w:br/>
+              <w:t>│ TẦNG 4: LỌC MẪU SUY BIẾN HÌNH HỌC (ANOMALY DETECTION) │</w:t>
+            </w:r>
+            <w:r>
+              <w:rPr>
+                <w:rFonts w:ascii="Consolas" w:hAnsi="Consolas"/>
+                <w:color w:val="1E2D3C"/>
+                <w:sz w:val="17"/>
+              </w:rPr>
+              <w:br/>
+              <w:t>│ 4.1 Bàn tay quá nhỏ / nhiễu nền (Area = w*h &lt; 0.005)   │</w:t>
+            </w:r>
+            <w:r>
+              <w:rPr>
+                <w:rFonts w:ascii="Consolas" w:hAnsi="Consolas"/>
+                <w:color w:val="1E2D3C"/>
+                <w:sz w:val="17"/>
+              </w:rPr>
+              <w:br/>
+              <w:t>│ 4.2 Tỉ lệ khung hình méo mó (Aspect Ratio w/h &gt; 4 hoặc │</w:t>
+            </w:r>
+            <w:r>
+              <w:rPr>
+                <w:rFonts w:ascii="Consolas" w:hAnsi="Consolas"/>
+                <w:color w:val="1E2D3C"/>
+                <w:sz w:val="17"/>
+              </w:rPr>
+              <w:br/>
+              <w:t>│     w/h &lt; 0.25)                                        │</w:t>
+            </w:r>
+            <w:r>
+              <w:rPr>
+                <w:rFonts w:ascii="Consolas" w:hAnsi="Consolas"/>
+                <w:color w:val="1E2D3C"/>
+                <w:sz w:val="17"/>
+              </w:rPr>
+              <w:br/>
+              <w:t>│ 4.3 Khớp xương trùng vị trí (Khoảng cách Euclid = 0)  │</w:t>
+            </w:r>
+            <w:r>
+              <w:rPr>
+                <w:rFonts w:ascii="Consolas" w:hAnsi="Consolas"/>
+                <w:color w:val="1E2D3C"/>
+                <w:sz w:val="17"/>
+              </w:rPr>
+              <w:br/>
+              <w:t>└────────────────────────────────────────────────────────┘</w:t>
+            </w:r>
+            <w:r>
+              <w:rPr>
+                <w:rFonts w:ascii="Consolas" w:hAnsi="Consolas"/>
+                <w:color w:val="1E2D3C"/>
+                <w:sz w:val="17"/>
+              </w:rPr>
+              <w:br/>
+              <w:t xml:space="preserve">           │</w:t>
+            </w:r>
+            <w:r>
+              <w:rPr>
+                <w:rFonts w:ascii="Consolas" w:hAnsi="Consolas"/>
+                <w:color w:val="1E2D3C"/>
+                <w:sz w:val="17"/>
+              </w:rPr>
+              <w:br/>
+              <w:t xml:space="preserve">           ▼</w:t>
+            </w:r>
+            <w:r>
+              <w:rPr>
+                <w:rFonts w:ascii="Consolas" w:hAnsi="Consolas"/>
+                <w:color w:val="1E2D3C"/>
+                <w:sz w:val="17"/>
+              </w:rPr>
+              <w:br/>
+              <w:t>[TẬP DỮ LIỆU SẠCH ĐẠT CHUẨN (GOLD DATASET) &amp; BÁO CÁO LOG]</w:t>
+            </w:r>
+          </w:p>
+        </w:tc>
+      </w:tr>
+    </w:tbl>
+    <w:p>
+      <w:pPr>
+        <w:spacing w:after="80"/>
+      </w:pPr>
+    </w:p>
+    <w:p>
+      <w:pPr>
+        <w:keepNext/>
+        <w:spacing w:before="200" w:after="60"/>
+      </w:pPr>
+      <w:r>
+        <w:rPr>
+          <w:rFonts w:ascii="Calibri" w:hAnsi="Calibri"/>
+          <w:b/>
+          <w:color w:val="1F6EA5"/>
+        </w:rPr>
+        <w:t>2.1. Chi tiết tiêu chí lọc dị biệt tọa độ (Out-of-Bounds &amp; Occlusion)</w:t>
+      </w:r>
+    </w:p>
+    <w:p>
+      <w:pPr>
+        <w:pStyle w:val="ListBullet"/>
+        <w:spacing w:after="50"/>
+      </w:pPr>
+      <w:r>
+        <w:rPr>
+          <w:rFonts w:ascii="Calibri" w:hAnsi="Calibri"/>
+          <w:color w:val="28323C"/>
+          <w:sz w:val="19"/>
+        </w:rPr>
+        <w:t>Tọa độ ngoài biên: Trong dữ liệu ảnh tự nhiên, có những trường hợp người thao tác đưa ngón tay ra sát viền ảnh dẫn đến x_i &lt; 0 hoặc x_i &gt; 1. Tất cả các điểm này nếu có v_i = 2 (nhìn thấy) là mâu thuẫn logic và phải được loại bỏ để bảo vệ mô hình không bị học đặc trưng nhiễu.</w:t>
+      </w:r>
+    </w:p>
+    <w:p>
+      <w:pPr>
+        <w:pStyle w:val="ListBullet"/>
+        <w:spacing w:after="50"/>
+      </w:pPr>
+      <w:r>
+        <w:rPr>
+          <w:rFonts w:ascii="Calibri" w:hAnsi="Calibri"/>
+          <w:color w:val="28323C"/>
+          <w:sz w:val="19"/>
+        </w:rPr>
+        <w:t>Visibility bất thường: Nếu một điểm có tọa độ (0.0, 0.0) nhưng giá trị v_i lại bằng 2 thì đó là lỗi gán nhãn gán nhầm điểm gốc. Quy chuẩn hợp lệ: Nếu điểm không xuất hiện thì v_i = 0.</w:t>
+      </w:r>
+    </w:p>
+    <w:p>
+      <w:pPr>
+        <w:keepNext/>
+        <w:spacing w:before="200" w:after="60"/>
+      </w:pPr>
+      <w:r>
+        <w:rPr>
+          <w:rFonts w:ascii="Calibri" w:hAnsi="Calibri"/>
+          <w:b/>
+          <w:color w:val="1F6EA5"/>
+        </w:rPr>
+        <w:t>2.2. Bảng tổng hợp kết quả làm sạch thực tế (Audit Results)</w:t>
+      </w:r>
+    </w:p>
+    <w:p>
+      <w:pPr>
+        <w:spacing w:after="70"/>
+        <w:rPr>
+          <w:rFonts w:ascii="Calibri" w:hAnsi="Calibri"/>
+          <w:color w:val="28323C"/>
+          <w:sz w:val="20"/>
+          <w:lang w:val="vi-VN"/>
+        </w:rPr>
+      </w:pPr>
+      <w:r>
+        <w:rPr>
+          <w:rFonts w:ascii="Calibri" w:hAnsi="Calibri"/>
+          <w:color w:val="28323C"/>
+          <w:sz w:val="20"/>
+        </w:rPr>
+        <w:t>Kết quả trích xuất trực tiếp từ quá trình thực thi data_cleaner.py và lưu tại reports/data_cleaning_report.json:</w:t>
+      </w:r>
+    </w:p>
+    <w:p>
+      <w:pPr>
+        <w:spacing w:after="70"/>
+        <w:rPr>
+          <w:sz w:val="20"/>
+          <w:lang w:val="vi-VN"/>
+        </w:rPr>
+      </w:pPr>
+    </w:p>
+    <w:p>
+      <w:pPr>
+        <w:spacing w:after="70"/>
+        <w:rPr>
+          <w:lang w:val="vi-VN"/>
+        </w:rPr>
+      </w:pPr>
     </w:p>
     <w:tbl>
       <w:tblPr>
@@ -547,6 +1060,7 @@
                 <w:color w:val="FFFFFF"/>
                 <w:sz w:val="18"/>
               </w:rPr>
+              <w:lastRenderedPageBreak/>
               <w:t>Tập Dữ Liệu</w:t>
             </w:r>
           </w:p>
@@ -1048,7 +1562,7 @@
     <w:p>
       <w:pPr>
         <w:keepNext/>
-        <w:spacing w:before="180" w:after="60"/>
+        <w:spacing w:before="200" w:after="60"/>
       </w:pPr>
       <w:r>
         <w:rPr>
@@ -1056,7 +1570,20 @@
           <w:b/>
           <w:color w:val="1F6EA5"/>
         </w:rPr>
-        <w:t>Phân tích chi tiết 693 mẫu vi phạm bị loại bỏ:</w:t>
+        <w:t>2.3. Phân tích chi tiết 693 mẫu vi phạm bị loại bỏ</w:t>
+      </w:r>
+    </w:p>
+    <w:p>
+      <w:pPr>
+        <w:spacing w:after="70"/>
+      </w:pPr>
+      <w:r>
+        <w:rPr>
+          <w:rFonts w:ascii="Calibri" w:hAnsi="Calibri"/>
+          <w:color w:val="28323C"/>
+          <w:sz w:val="20"/>
+        </w:rPr>
+        <w:t>Thống kê chi tiết các mẫu vi phạm bị bộ lọc cách ly:</w:t>
       </w:r>
     </w:p>
     <w:p>
@@ -1070,7 +1597,7 @@
           <w:color w:val="28323C"/>
           <w:sz w:val="19"/>
         </w:rPr>
-        <w:t>672 mẫu (96.97% tổng lỗi): Vi phạm KPT_OUT_OF_BOUNDS (tọa độ ngón tay ngoài [0, 1] do tay sát viền ảnh: Train 489, Val 183).</w:t>
+        <w:t>Lỗi KPT_OUT_OF_BOUNDS (672 mẫu - Chiếm 96.97% tổng lỗi): Tọa độ ngón tay bị trôi ra ngoài biên ảnh (x &lt; 0 hoặc x &gt; 1) khi người chụp đưa tay sát mép camera (Train: 489 mẫu, Val: 183 mẫu). Việc loại bỏ hoàn toàn các mẫu này giúp mô hình không bị học các đặc trưng biến dạng ngoại lai.</w:t>
       </w:r>
     </w:p>
     <w:p>
@@ -1084,7 +1611,7 @@
           <w:color w:val="28323C"/>
           <w:sz w:val="19"/>
         </w:rPr>
-        <w:t>18 mẫu (2.60% tổng lỗi): Vi phạm ABNORMAL_AR (tỉ lệ khung hình w/h méo mó: Train 14, Val 4).</w:t>
+        <w:t>Lỗi ABNORMAL_AR (18 mẫu - Chiếm 2.60% tổng lỗi): Tỉ lệ khung hình w/h bị méo mó cực đoan (Train: 14 mẫu, Val: 4 mẫu).</w:t>
       </w:r>
     </w:p>
     <w:p>
@@ -1098,7 +1625,7 @@
           <w:color w:val="28323C"/>
           <w:sz w:val="19"/>
         </w:rPr>
-        <w:t>3 mẫu (0.43% tổng lỗi): Vi phạm INVALID_BBOX (tọa độ tâm hộp ngoài biên: Train 2, Val 1).</w:t>
+        <w:t>Lỗi INVALID_BBOX (3 mẫu - Chiếm 0.43% tổng lỗi): Tọa độ tâm hộp gán ngoài biên [0, 1] (Train: 2 mẫu, Val: 1 mẫu).</w:t>
       </w:r>
     </w:p>
     <w:p>
@@ -1112,13 +1639,13 @@
           <w:color w:val="28323C"/>
           <w:sz w:val="19"/>
         </w:rPr>
-        <w:t>0 mẫu ảnh hỏng: Toàn bộ ảnh đều đọc tốt mã nhị phân.</w:t>
+        <w:t>Lỗi ảnh hỏng (Corrupt JPEG): 0 mẫu (Toàn bộ 26.768 ảnh đều nguyên vẹn mã nhị phân).</w:t>
       </w:r>
     </w:p>
     <w:p>
       <w:pPr>
         <w:keepNext/>
-        <w:spacing w:before="260" w:after="80"/>
+        <w:spacing w:before="280" w:after="100"/>
       </w:pPr>
       <w:r>
         <w:rPr>
@@ -1127,7 +1654,21 @@
           <w:color w:val="124066"/>
           <w:sz w:val="26"/>
         </w:rPr>
-        <w:t>3. THỐNG KÊ ĐẶC TRƯNG HÌNH HỌC TỪ 26.075 MẪU SẠCH (DATA PROFILING)</w:t>
+        <w:t>3. KỸ THUẬT &amp; QUY CHUẨN TRỰC QUAN HÓA DỮ LIỆU CHUYÊN SÂU</w:t>
+      </w:r>
+    </w:p>
+    <w:p>
+      <w:pPr>
+        <w:keepNext/>
+        <w:spacing w:before="200" w:after="60"/>
+      </w:pPr>
+      <w:r>
+        <w:rPr>
+          <w:rFonts w:ascii="Calibri" w:hAnsi="Calibri"/>
+          <w:b/>
+          <w:color w:val="1F6EA5"/>
+        </w:rPr>
+        <w:t>3.1. Trực quan hóa hình học khung xương 21 điểm (Hand Skeleton Overlay)</w:t>
       </w:r>
     </w:p>
     <w:p>
@@ -1140,7 +1681,552 @@
           <w:color w:val="28323C"/>
           <w:sz w:val="20"/>
         </w:rPr>
-        <w:t>Bảng phân bố định lượng trích xuất từ clean_metrics.json làm nền tảng cho Bước 2:</w:t>
+        <w:t>Để đánh giá bằng mắt thường độ chính xác của nhãn bàn tay sau khi làm sạch, cần xây dựng bộ trực quan hóa đồ họa hoàn chỉnh:</w:t>
+      </w:r>
+    </w:p>
+    <w:tbl>
+      <w:tblPr>
+        <w:tblW w:w="0" w:type="auto"/>
+        <w:jc w:val="center"/>
+        <w:tblLook w:val="04A0" w:firstRow="1" w:lastRow="0" w:firstColumn="1" w:lastColumn="0" w:noHBand="0" w:noVBand="1"/>
+      </w:tblPr>
+      <w:tblGrid>
+        <w:gridCol w:w="3264"/>
+        <w:gridCol w:w="3264"/>
+        <w:gridCol w:w="3264"/>
+      </w:tblGrid>
+      <w:tr>
+        <w:trPr>
+          <w:jc w:val="center"/>
+        </w:trPr>
+        <w:tc>
+          <w:tcPr>
+            <w:tcW w:w="3264" w:type="dxa"/>
+            <w:shd w:val="clear" w:color="auto" w:fill="124066"/>
+            <w:tcMar>
+              <w:top w:w="90" w:type="dxa"/>
+              <w:left w:w="110" w:type="dxa"/>
+              <w:bottom w:w="90" w:type="dxa"/>
+              <w:right w:w="110" w:type="dxa"/>
+            </w:tcMar>
+          </w:tcPr>
+          <w:p>
+            <w:pPr>
+              <w:jc w:val="center"/>
+            </w:pPr>
+            <w:r>
+              <w:rPr>
+                <w:rFonts w:ascii="Calibri" w:hAnsi="Calibri"/>
+                <w:b/>
+                <w:color w:val="FFFFFF"/>
+                <w:sz w:val="19"/>
+              </w:rPr>
+              <w:t>Nhóm Khớp Ngón Tay</w:t>
+            </w:r>
+          </w:p>
+        </w:tc>
+        <w:tc>
+          <w:tcPr>
+            <w:tcW w:w="3264" w:type="dxa"/>
+            <w:shd w:val="clear" w:color="auto" w:fill="124066"/>
+            <w:tcMar>
+              <w:top w:w="90" w:type="dxa"/>
+              <w:left w:w="110" w:type="dxa"/>
+              <w:bottom w:w="90" w:type="dxa"/>
+              <w:right w:w="110" w:type="dxa"/>
+            </w:tcMar>
+          </w:tcPr>
+          <w:p>
+            <w:pPr>
+              <w:jc w:val="center"/>
+            </w:pPr>
+            <w:r>
+              <w:rPr>
+                <w:rFonts w:ascii="Calibri" w:hAnsi="Calibri"/>
+                <w:b/>
+                <w:color w:val="FFFFFF"/>
+                <w:sz w:val="19"/>
+              </w:rPr>
+              <w:t>Các Điểm Mấu Chốt (Keypoint IDs)</w:t>
+            </w:r>
+          </w:p>
+        </w:tc>
+        <w:tc>
+          <w:tcPr>
+            <w:tcW w:w="3264" w:type="dxa"/>
+            <w:shd w:val="clear" w:color="auto" w:fill="124066"/>
+            <w:tcMar>
+              <w:top w:w="90" w:type="dxa"/>
+              <w:left w:w="110" w:type="dxa"/>
+              <w:bottom w:w="90" w:type="dxa"/>
+              <w:right w:w="110" w:type="dxa"/>
+            </w:tcMar>
+          </w:tcPr>
+          <w:p>
+            <w:pPr>
+              <w:jc w:val="center"/>
+            </w:pPr>
+            <w:r>
+              <w:rPr>
+                <w:rFonts w:ascii="Calibri" w:hAnsi="Calibri"/>
+                <w:b/>
+                <w:color w:val="FFFFFF"/>
+                <w:sz w:val="19"/>
+              </w:rPr>
+              <w:t>Màu Sắc Quy Định (RGB)</w:t>
+            </w:r>
+          </w:p>
+        </w:tc>
+      </w:tr>
+      <w:tr>
+        <w:trPr>
+          <w:jc w:val="center"/>
+        </w:trPr>
+        <w:tc>
+          <w:tcPr>
+            <w:tcW w:w="3264" w:type="dxa"/>
+            <w:tcMar>
+              <w:top w:w="70" w:type="dxa"/>
+              <w:left w:w="90" w:type="dxa"/>
+              <w:bottom w:w="70" w:type="dxa"/>
+              <w:right w:w="90" w:type="dxa"/>
+            </w:tcMar>
+          </w:tcPr>
+          <w:p>
+            <w:r>
+              <w:rPr>
+                <w:rFonts w:ascii="Calibri" w:hAnsi="Calibri"/>
+                <w:color w:val="28323C"/>
+                <w:sz w:val="18"/>
+              </w:rPr>
+              <w:t>Gốc cổ tay &amp; Lòng bàn tay</w:t>
+            </w:r>
+          </w:p>
+        </w:tc>
+        <w:tc>
+          <w:tcPr>
+            <w:tcW w:w="3264" w:type="dxa"/>
+            <w:tcMar>
+              <w:top w:w="70" w:type="dxa"/>
+              <w:left w:w="90" w:type="dxa"/>
+              <w:bottom w:w="70" w:type="dxa"/>
+              <w:right w:w="90" w:type="dxa"/>
+            </w:tcMar>
+          </w:tcPr>
+          <w:p>
+            <w:r>
+              <w:rPr>
+                <w:rFonts w:ascii="Calibri" w:hAnsi="Calibri"/>
+                <w:color w:val="28323C"/>
+                <w:sz w:val="18"/>
+              </w:rPr>
+              <w:t>0 (Wrist), Nối 0-&gt;1, 0-&gt;5, 0-&gt;17, 5-&gt;9-&gt;13-&gt;17</w:t>
+            </w:r>
+          </w:p>
+        </w:tc>
+        <w:tc>
+          <w:tcPr>
+            <w:tcW w:w="3264" w:type="dxa"/>
+            <w:tcMar>
+              <w:top w:w="70" w:type="dxa"/>
+              <w:left w:w="90" w:type="dxa"/>
+              <w:bottom w:w="70" w:type="dxa"/>
+              <w:right w:w="90" w:type="dxa"/>
+            </w:tcMar>
+          </w:tcPr>
+          <w:p>
+            <w:r>
+              <w:rPr>
+                <w:rFonts w:ascii="Calibri" w:hAnsi="Calibri"/>
+                <w:color w:val="28323C"/>
+                <w:sz w:val="18"/>
+              </w:rPr>
+              <w:t>Trắng (255, 255, 255)</w:t>
+            </w:r>
+          </w:p>
+        </w:tc>
+      </w:tr>
+      <w:tr>
+        <w:trPr>
+          <w:jc w:val="center"/>
+        </w:trPr>
+        <w:tc>
+          <w:tcPr>
+            <w:tcW w:w="3264" w:type="dxa"/>
+            <w:shd w:val="clear" w:color="auto" w:fill="F4F6F7"/>
+            <w:tcMar>
+              <w:top w:w="70" w:type="dxa"/>
+              <w:left w:w="90" w:type="dxa"/>
+              <w:bottom w:w="70" w:type="dxa"/>
+              <w:right w:w="90" w:type="dxa"/>
+            </w:tcMar>
+          </w:tcPr>
+          <w:p>
+            <w:r>
+              <w:rPr>
+                <w:rFonts w:ascii="Calibri" w:hAnsi="Calibri"/>
+                <w:color w:val="28323C"/>
+                <w:sz w:val="18"/>
+              </w:rPr>
+              <w:t>Ngón cái (Thumb - Zoom)</w:t>
+            </w:r>
+          </w:p>
+        </w:tc>
+        <w:tc>
+          <w:tcPr>
+            <w:tcW w:w="3264" w:type="dxa"/>
+            <w:shd w:val="clear" w:color="auto" w:fill="F4F6F7"/>
+            <w:tcMar>
+              <w:top w:w="70" w:type="dxa"/>
+              <w:left w:w="90" w:type="dxa"/>
+              <w:bottom w:w="70" w:type="dxa"/>
+              <w:right w:w="90" w:type="dxa"/>
+            </w:tcMar>
+          </w:tcPr>
+          <w:p>
+            <w:r>
+              <w:rPr>
+                <w:rFonts w:ascii="Calibri" w:hAnsi="Calibri"/>
+                <w:color w:val="28323C"/>
+                <w:sz w:val="18"/>
+              </w:rPr>
+              <w:t>1 (CMC), 2 (MCP), 3 (IP), 4 (TIP)</w:t>
+            </w:r>
+          </w:p>
+        </w:tc>
+        <w:tc>
+          <w:tcPr>
+            <w:tcW w:w="3264" w:type="dxa"/>
+            <w:shd w:val="clear" w:color="auto" w:fill="F4F6F7"/>
+            <w:tcMar>
+              <w:top w:w="70" w:type="dxa"/>
+              <w:left w:w="90" w:type="dxa"/>
+              <w:bottom w:w="70" w:type="dxa"/>
+              <w:right w:w="90" w:type="dxa"/>
+            </w:tcMar>
+          </w:tcPr>
+          <w:p>
+            <w:r>
+              <w:rPr>
+                <w:rFonts w:ascii="Calibri" w:hAnsi="Calibri"/>
+                <w:color w:val="28323C"/>
+                <w:sz w:val="18"/>
+              </w:rPr>
+              <w:t>Đỏ (231, 76, 60)</w:t>
+            </w:r>
+          </w:p>
+        </w:tc>
+      </w:tr>
+      <w:tr>
+        <w:trPr>
+          <w:jc w:val="center"/>
+        </w:trPr>
+        <w:tc>
+          <w:tcPr>
+            <w:tcW w:w="3264" w:type="dxa"/>
+            <w:tcMar>
+              <w:top w:w="70" w:type="dxa"/>
+              <w:left w:w="90" w:type="dxa"/>
+              <w:bottom w:w="70" w:type="dxa"/>
+              <w:right w:w="90" w:type="dxa"/>
+            </w:tcMar>
+          </w:tcPr>
+          <w:p>
+            <w:r>
+              <w:rPr>
+                <w:rFonts w:ascii="Calibri" w:hAnsi="Calibri"/>
+                <w:color w:val="28323C"/>
+                <w:sz w:val="18"/>
+              </w:rPr>
+              <w:t>Ngón trỏ (Index - Con trỏ)</w:t>
+            </w:r>
+          </w:p>
+        </w:tc>
+        <w:tc>
+          <w:tcPr>
+            <w:tcW w:w="3264" w:type="dxa"/>
+            <w:tcMar>
+              <w:top w:w="70" w:type="dxa"/>
+              <w:left w:w="90" w:type="dxa"/>
+              <w:bottom w:w="70" w:type="dxa"/>
+              <w:right w:w="90" w:type="dxa"/>
+            </w:tcMar>
+          </w:tcPr>
+          <w:p>
+            <w:r>
+              <w:rPr>
+                <w:rFonts w:ascii="Calibri" w:hAnsi="Calibri"/>
+                <w:color w:val="28323C"/>
+                <w:sz w:val="18"/>
+              </w:rPr>
+              <w:t>5 (MCP), 6 (PIP), 7 (DIP), 8 (TIP)</w:t>
+            </w:r>
+          </w:p>
+        </w:tc>
+        <w:tc>
+          <w:tcPr>
+            <w:tcW w:w="3264" w:type="dxa"/>
+            <w:tcMar>
+              <w:top w:w="70" w:type="dxa"/>
+              <w:left w:w="90" w:type="dxa"/>
+              <w:bottom w:w="70" w:type="dxa"/>
+              <w:right w:w="90" w:type="dxa"/>
+            </w:tcMar>
+          </w:tcPr>
+          <w:p>
+            <w:r>
+              <w:rPr>
+                <w:rFonts w:ascii="Calibri" w:hAnsi="Calibri"/>
+                <w:color w:val="28323C"/>
+                <w:sz w:val="18"/>
+              </w:rPr>
+              <w:t>Xanh lá (46, 204, 113)</w:t>
+            </w:r>
+          </w:p>
+        </w:tc>
+      </w:tr>
+      <w:tr>
+        <w:trPr>
+          <w:jc w:val="center"/>
+        </w:trPr>
+        <w:tc>
+          <w:tcPr>
+            <w:tcW w:w="3264" w:type="dxa"/>
+            <w:shd w:val="clear" w:color="auto" w:fill="F4F6F7"/>
+            <w:tcMar>
+              <w:top w:w="70" w:type="dxa"/>
+              <w:left w:w="90" w:type="dxa"/>
+              <w:bottom w:w="70" w:type="dxa"/>
+              <w:right w:w="90" w:type="dxa"/>
+            </w:tcMar>
+          </w:tcPr>
+          <w:p>
+            <w:r>
+              <w:rPr>
+                <w:rFonts w:ascii="Calibri" w:hAnsi="Calibri"/>
+                <w:color w:val="28323C"/>
+                <w:sz w:val="18"/>
+              </w:rPr>
+              <w:t>Ngón giữa (Middle)</w:t>
+            </w:r>
+          </w:p>
+        </w:tc>
+        <w:tc>
+          <w:tcPr>
+            <w:tcW w:w="3264" w:type="dxa"/>
+            <w:shd w:val="clear" w:color="auto" w:fill="F4F6F7"/>
+            <w:tcMar>
+              <w:top w:w="70" w:type="dxa"/>
+              <w:left w:w="90" w:type="dxa"/>
+              <w:bottom w:w="70" w:type="dxa"/>
+              <w:right w:w="90" w:type="dxa"/>
+            </w:tcMar>
+          </w:tcPr>
+          <w:p>
+            <w:r>
+              <w:rPr>
+                <w:rFonts w:ascii="Calibri" w:hAnsi="Calibri"/>
+                <w:color w:val="28323C"/>
+                <w:sz w:val="18"/>
+              </w:rPr>
+              <w:t>9 (MCP), 10 (PIP), 11 (DIP), 12 (TIP)</w:t>
+            </w:r>
+          </w:p>
+        </w:tc>
+        <w:tc>
+          <w:tcPr>
+            <w:tcW w:w="3264" w:type="dxa"/>
+            <w:shd w:val="clear" w:color="auto" w:fill="F4F6F7"/>
+            <w:tcMar>
+              <w:top w:w="70" w:type="dxa"/>
+              <w:left w:w="90" w:type="dxa"/>
+              <w:bottom w:w="70" w:type="dxa"/>
+              <w:right w:w="90" w:type="dxa"/>
+            </w:tcMar>
+          </w:tcPr>
+          <w:p>
+            <w:r>
+              <w:rPr>
+                <w:rFonts w:ascii="Calibri" w:hAnsi="Calibri"/>
+                <w:color w:val="28323C"/>
+                <w:sz w:val="18"/>
+              </w:rPr>
+              <w:t>Xanh dương (52, 152, 219)</w:t>
+            </w:r>
+          </w:p>
+        </w:tc>
+      </w:tr>
+      <w:tr>
+        <w:trPr>
+          <w:jc w:val="center"/>
+        </w:trPr>
+        <w:tc>
+          <w:tcPr>
+            <w:tcW w:w="3264" w:type="dxa"/>
+            <w:tcMar>
+              <w:top w:w="70" w:type="dxa"/>
+              <w:left w:w="90" w:type="dxa"/>
+              <w:bottom w:w="70" w:type="dxa"/>
+              <w:right w:w="90" w:type="dxa"/>
+            </w:tcMar>
+          </w:tcPr>
+          <w:p>
+            <w:r>
+              <w:rPr>
+                <w:rFonts w:ascii="Calibri" w:hAnsi="Calibri"/>
+                <w:color w:val="28323C"/>
+                <w:sz w:val="18"/>
+              </w:rPr>
+              <w:t>Ngón áp út (Ring)</w:t>
+            </w:r>
+          </w:p>
+        </w:tc>
+        <w:tc>
+          <w:tcPr>
+            <w:tcW w:w="3264" w:type="dxa"/>
+            <w:tcMar>
+              <w:top w:w="70" w:type="dxa"/>
+              <w:left w:w="90" w:type="dxa"/>
+              <w:bottom w:w="70" w:type="dxa"/>
+              <w:right w:w="90" w:type="dxa"/>
+            </w:tcMar>
+          </w:tcPr>
+          <w:p>
+            <w:r>
+              <w:rPr>
+                <w:rFonts w:ascii="Calibri" w:hAnsi="Calibri"/>
+                <w:color w:val="28323C"/>
+                <w:sz w:val="18"/>
+              </w:rPr>
+              <w:t>13 (MCP), 14 (PIP), 15 (DIP), 16 (TIP)</w:t>
+            </w:r>
+          </w:p>
+        </w:tc>
+        <w:tc>
+          <w:tcPr>
+            <w:tcW w:w="3264" w:type="dxa"/>
+            <w:tcMar>
+              <w:top w:w="70" w:type="dxa"/>
+              <w:left w:w="90" w:type="dxa"/>
+              <w:bottom w:w="70" w:type="dxa"/>
+              <w:right w:w="90" w:type="dxa"/>
+            </w:tcMar>
+          </w:tcPr>
+          <w:p>
+            <w:r>
+              <w:rPr>
+                <w:rFonts w:ascii="Calibri" w:hAnsi="Calibri"/>
+                <w:color w:val="28323C"/>
+                <w:sz w:val="18"/>
+              </w:rPr>
+              <w:t>Vàng cam (243, 156, 18)</w:t>
+            </w:r>
+          </w:p>
+        </w:tc>
+      </w:tr>
+      <w:tr>
+        <w:trPr>
+          <w:jc w:val="center"/>
+        </w:trPr>
+        <w:tc>
+          <w:tcPr>
+            <w:tcW w:w="3264" w:type="dxa"/>
+            <w:shd w:val="clear" w:color="auto" w:fill="F4F6F7"/>
+            <w:tcMar>
+              <w:top w:w="70" w:type="dxa"/>
+              <w:left w:w="90" w:type="dxa"/>
+              <w:bottom w:w="70" w:type="dxa"/>
+              <w:right w:w="90" w:type="dxa"/>
+            </w:tcMar>
+          </w:tcPr>
+          <w:p>
+            <w:r>
+              <w:rPr>
+                <w:rFonts w:ascii="Calibri" w:hAnsi="Calibri"/>
+                <w:color w:val="28323C"/>
+                <w:sz w:val="18"/>
+              </w:rPr>
+              <w:t>Ngón út (Pinky)</w:t>
+            </w:r>
+          </w:p>
+        </w:tc>
+        <w:tc>
+          <w:tcPr>
+            <w:tcW w:w="3264" w:type="dxa"/>
+            <w:shd w:val="clear" w:color="auto" w:fill="F4F6F7"/>
+            <w:tcMar>
+              <w:top w:w="70" w:type="dxa"/>
+              <w:left w:w="90" w:type="dxa"/>
+              <w:bottom w:w="70" w:type="dxa"/>
+              <w:right w:w="90" w:type="dxa"/>
+            </w:tcMar>
+          </w:tcPr>
+          <w:p>
+            <w:r>
+              <w:rPr>
+                <w:rFonts w:ascii="Calibri" w:hAnsi="Calibri"/>
+                <w:color w:val="28323C"/>
+                <w:sz w:val="18"/>
+              </w:rPr>
+              <w:t>17 (MCP), 18 (PIP), 19 (DIP), 20 (TIP)</w:t>
+            </w:r>
+          </w:p>
+        </w:tc>
+        <w:tc>
+          <w:tcPr>
+            <w:tcW w:w="3264" w:type="dxa"/>
+            <w:shd w:val="clear" w:color="auto" w:fill="F4F6F7"/>
+            <w:tcMar>
+              <w:top w:w="70" w:type="dxa"/>
+              <w:left w:w="90" w:type="dxa"/>
+              <w:bottom w:w="70" w:type="dxa"/>
+              <w:right w:w="90" w:type="dxa"/>
+            </w:tcMar>
+          </w:tcPr>
+          <w:p>
+            <w:r>
+              <w:rPr>
+                <w:rFonts w:ascii="Calibri" w:hAnsi="Calibri"/>
+                <w:color w:val="28323C"/>
+                <w:sz w:val="18"/>
+              </w:rPr>
+              <w:t>Tím (155, 89, 182)</w:t>
+            </w:r>
+          </w:p>
+        </w:tc>
+      </w:tr>
+    </w:tbl>
+    <w:p>
+      <w:pPr>
+        <w:spacing w:after="120"/>
+      </w:pPr>
+    </w:p>
+    <w:p>
+      <w:pPr>
+        <w:keepNext/>
+        <w:spacing w:before="200" w:after="60"/>
+      </w:pPr>
+      <w:r>
+        <w:rPr>
+          <w:rFonts w:ascii="Calibri" w:hAnsi="Calibri"/>
+          <w:b/>
+          <w:color w:val="1F6EA5"/>
+        </w:rPr>
+        <w:lastRenderedPageBreak/>
+        <w:t>3.2. Bảng thống kê phân tích 7 chỉ số không gian định lượng từ 26.075 mẫu sạch</w:t>
+      </w:r>
+    </w:p>
+    <w:p>
+      <w:pPr>
+        <w:spacing w:after="70"/>
+      </w:pPr>
+      <w:r>
+        <w:rPr>
+          <w:rFonts w:ascii="Calibri" w:hAnsi="Calibri"/>
+          <w:color w:val="28323C"/>
+          <w:sz w:val="20"/>
+        </w:rPr>
+        <w:t>Từ tệp reports/clean_metrics.json chứa dữ liệu của 26.075 mẫu đạt chuẩn, hệ thống trích xuất các chỉ số toán học phân bố:</w:t>
       </w:r>
     </w:p>
     <w:tbl>
@@ -2584,16 +3670,7 @@
                 <w:color w:val="28323C"/>
                 <w:sz w:val="17"/>
               </w:rPr>
-              <w:t xml:space="preserve">Tọa độ Y ngón </w:t>
-            </w:r>
-            <w:r>
-              <w:rPr>
-                <w:rFonts w:ascii="Calibri" w:hAnsi="Calibri"/>
-                <w:color w:val="28323C"/>
-                <w:sz w:val="17"/>
-              </w:rPr>
-              <w:lastRenderedPageBreak/>
-              <w:t>trỏ (Con trỏ)</w:t>
+              <w:t>Tọa độ Y ngón trỏ (Con trỏ)</w:t>
             </w:r>
           </w:p>
         </w:tc>
@@ -2617,7 +3694,6 @@
                 <w:color w:val="28323C"/>
                 <w:sz w:val="17"/>
               </w:rPr>
-              <w:lastRenderedPageBreak/>
               <w:t>0.5647</w:t>
             </w:r>
           </w:p>
@@ -2752,7 +3828,7 @@
     <w:p>
       <w:pPr>
         <w:keepNext/>
-        <w:spacing w:before="260" w:after="80"/>
+        <w:spacing w:before="280" w:after="100"/>
       </w:pPr>
       <w:r>
         <w:rPr>
@@ -2761,7 +3837,653 @@
           <w:color w:val="124066"/>
           <w:sz w:val="26"/>
         </w:rPr>
-        <w:t>4. KẾ HOẠCH CHI TIẾT BƯỚC 2: TRỰC QUAN HÓA DỮ LIỆU (DATA VISUALIZATION)</w:t>
+        <w:t>4</w:t>
+      </w:r>
+      <w:r>
+        <w:rPr>
+          <w:rFonts w:ascii="Calibri" w:hAnsi="Calibri"/>
+          <w:b/>
+          <w:color w:val="124066"/>
+          <w:sz w:val="26"/>
+        </w:rPr>
+        <w:t>. QUY TRÌNH TRỰC QUAN HÓA DỮ LIỆU TOÀN DIỆN (DATA VISUALIZATION PIPELINE)</w:t>
+      </w:r>
+    </w:p>
+    <w:p>
+      <w:pPr>
+        <w:spacing w:after="70"/>
+        <w:rPr>
+          <w:rFonts w:ascii="Calibri" w:hAnsi="Calibri"/>
+          <w:color w:val="28323C"/>
+          <w:sz w:val="20"/>
+          <w:lang w:val="vi-VN"/>
+        </w:rPr>
+      </w:pPr>
+      <w:r>
+        <w:rPr>
+          <w:rFonts w:ascii="Calibri" w:hAnsi="Calibri"/>
+          <w:color w:val="28323C"/>
+          <w:sz w:val="20"/>
+        </w:rPr>
+        <w:t>Quy trình trực quan hóa dữ liệu được thiết kế gồm 5 giai đoạn liên hoàn (5-Stage Visualization Pipeline), đảm bảo chuyển đổi dữ liệu tọa độ số thực thành các thông số thị giác có giá trị thực tiễn:</w:t>
+      </w:r>
+    </w:p>
+    <w:p>
+      <w:pPr>
+        <w:spacing w:after="70"/>
+        <w:rPr>
+          <w:color w:val="28323C"/>
+          <w:sz w:val="20"/>
+          <w:lang w:val="vi-VN"/>
+        </w:rPr>
+      </w:pPr>
+    </w:p>
+    <w:p>
+      <w:pPr>
+        <w:spacing w:after="70"/>
+        <w:rPr>
+          <w:color w:val="28323C"/>
+          <w:sz w:val="20"/>
+          <w:lang w:val="vi-VN"/>
+        </w:rPr>
+      </w:pPr>
+    </w:p>
+    <w:p>
+      <w:pPr>
+        <w:spacing w:after="70"/>
+        <w:rPr>
+          <w:color w:val="28323C"/>
+          <w:sz w:val="20"/>
+          <w:lang w:val="vi-VN"/>
+        </w:rPr>
+      </w:pPr>
+    </w:p>
+    <w:p>
+      <w:pPr>
+        <w:spacing w:after="70"/>
+        <w:rPr>
+          <w:color w:val="28323C"/>
+          <w:sz w:val="20"/>
+          <w:lang w:val="vi-VN"/>
+        </w:rPr>
+      </w:pPr>
+    </w:p>
+    <w:p>
+      <w:pPr>
+        <w:spacing w:after="70"/>
+        <w:rPr>
+          <w:color w:val="28323C"/>
+          <w:sz w:val="20"/>
+          <w:lang w:val="vi-VN"/>
+        </w:rPr>
+      </w:pPr>
+    </w:p>
+    <w:p>
+      <w:pPr>
+        <w:spacing w:after="70"/>
+        <w:rPr>
+          <w:color w:val="28323C"/>
+          <w:sz w:val="20"/>
+          <w:lang w:val="vi-VN"/>
+        </w:rPr>
+      </w:pPr>
+    </w:p>
+    <w:p>
+      <w:pPr>
+        <w:spacing w:after="70"/>
+        <w:rPr>
+          <w:color w:val="28323C"/>
+          <w:sz w:val="20"/>
+          <w:lang w:val="vi-VN"/>
+        </w:rPr>
+      </w:pPr>
+    </w:p>
+    <w:p>
+      <w:pPr>
+        <w:spacing w:after="70"/>
+        <w:rPr>
+          <w:color w:val="28323C"/>
+          <w:sz w:val="20"/>
+          <w:lang w:val="vi-VN"/>
+        </w:rPr>
+      </w:pPr>
+    </w:p>
+    <w:p>
+      <w:pPr>
+        <w:spacing w:after="70"/>
+        <w:rPr>
+          <w:color w:val="28323C"/>
+          <w:sz w:val="20"/>
+          <w:lang w:val="vi-VN"/>
+        </w:rPr>
+      </w:pPr>
+    </w:p>
+    <w:p>
+      <w:pPr>
+        <w:spacing w:after="70"/>
+        <w:rPr>
+          <w:color w:val="28323C"/>
+          <w:sz w:val="20"/>
+          <w:lang w:val="vi-VN"/>
+        </w:rPr>
+      </w:pPr>
+    </w:p>
+    <w:p>
+      <w:pPr>
+        <w:spacing w:after="70"/>
+        <w:rPr>
+          <w:color w:val="28323C"/>
+          <w:sz w:val="20"/>
+          <w:lang w:val="vi-VN"/>
+        </w:rPr>
+      </w:pPr>
+    </w:p>
+    <w:p>
+      <w:pPr>
+        <w:spacing w:after="70"/>
+        <w:rPr>
+          <w:color w:val="28323C"/>
+          <w:sz w:val="20"/>
+          <w:lang w:val="vi-VN"/>
+        </w:rPr>
+      </w:pPr>
+    </w:p>
+    <w:p>
+      <w:pPr>
+        <w:spacing w:after="70"/>
+        <w:rPr>
+          <w:color w:val="28323C"/>
+          <w:sz w:val="20"/>
+          <w:lang w:val="vi-VN"/>
+        </w:rPr>
+      </w:pPr>
+    </w:p>
+    <w:p>
+      <w:pPr>
+        <w:spacing w:after="70"/>
+        <w:rPr>
+          <w:lang w:val="vi-VN"/>
+        </w:rPr>
+      </w:pPr>
+    </w:p>
+    <w:tbl>
+      <w:tblPr>
+        <w:tblW w:w="0" w:type="auto"/>
+        <w:jc w:val="center"/>
+        <w:tblLook w:val="04A0" w:firstRow="1" w:lastRow="0" w:firstColumn="1" w:lastColumn="0" w:noHBand="0" w:noVBand="1"/>
+      </w:tblPr>
+      <w:tblGrid>
+        <w:gridCol w:w="8019"/>
+      </w:tblGrid>
+      <w:tr>
+        <w:trPr>
+          <w:jc w:val="center"/>
+        </w:trPr>
+        <w:tc>
+          <w:tcPr>
+            <w:tcW w:w="8019" w:type="dxa"/>
+            <w:shd w:val="clear" w:color="auto" w:fill="F8F9F9"/>
+            <w:tcMar>
+              <w:top w:w="70" w:type="dxa"/>
+              <w:left w:w="120" w:type="dxa"/>
+              <w:bottom w:w="70" w:type="dxa"/>
+              <w:right w:w="120" w:type="dxa"/>
+            </w:tcMar>
+          </w:tcPr>
+          <w:p>
+            <w:pPr>
+              <w:spacing w:after="0" w:line="264" w:lineRule="auto"/>
+              <w:rPr>
+                <w:lang w:val="vi-VN"/>
+              </w:rPr>
+            </w:pPr>
+            <w:r>
+              <w:rPr>
+                <w:rFonts w:ascii="Consolas" w:hAnsi="Consolas"/>
+                <w:color w:val="1E2D3C"/>
+                <w:sz w:val="17"/>
+                <w:lang w:val="vi-VN"/>
+              </w:rPr>
+              <w:lastRenderedPageBreak/>
+              <w:t>[Tập dữ liệu sạch &amp; Ma trận đặc trưng: clean_metrics.json]</w:t>
+            </w:r>
+            <w:r>
+              <w:rPr>
+                <w:rFonts w:ascii="Consolas" w:hAnsi="Consolas"/>
+                <w:color w:val="1E2D3C"/>
+                <w:sz w:val="17"/>
+                <w:lang w:val="vi-VN"/>
+              </w:rPr>
+              <w:br/>
+              <w:t xml:space="preserve">                          │</w:t>
+            </w:r>
+            <w:r>
+              <w:rPr>
+                <w:rFonts w:ascii="Consolas" w:hAnsi="Consolas"/>
+                <w:color w:val="1E2D3C"/>
+                <w:sz w:val="17"/>
+                <w:lang w:val="vi-VN"/>
+              </w:rPr>
+              <w:br/>
+              <w:t xml:space="preserve">                          ▼</w:t>
+            </w:r>
+            <w:r>
+              <w:rPr>
+                <w:rFonts w:ascii="Consolas" w:hAnsi="Consolas"/>
+                <w:color w:val="1E2D3C"/>
+                <w:sz w:val="17"/>
+                <w:lang w:val="vi-VN"/>
+              </w:rPr>
+              <w:br/>
+              <w:t>┌────────────────────────────────────────────────────────────────────────┐</w:t>
+            </w:r>
+            <w:r>
+              <w:rPr>
+                <w:rFonts w:ascii="Consolas" w:hAnsi="Consolas"/>
+                <w:color w:val="1E2D3C"/>
+                <w:sz w:val="17"/>
+                <w:lang w:val="vi-VN"/>
+              </w:rPr>
+              <w:br/>
+              <w:t>│ GIAI ĐOẠN 1: NẠP &amp; ĐỐI SOÁT CHỈ MỤC SẠCH (DATA INGESTION)              │</w:t>
+            </w:r>
+            <w:r>
+              <w:rPr>
+                <w:rFonts w:ascii="Consolas" w:hAnsi="Consolas"/>
+                <w:color w:val="1E2D3C"/>
+                <w:sz w:val="17"/>
+                <w:lang w:val="vi-VN"/>
+              </w:rPr>
+              <w:br/>
+              <w:t>│ - Tải 26.075 bản ghi đặc trưng vào cấu trúc Pandas DataFrame           │</w:t>
+            </w:r>
+            <w:r>
+              <w:rPr>
+                <w:rFonts w:ascii="Consolas" w:hAnsi="Consolas"/>
+                <w:color w:val="1E2D3C"/>
+                <w:sz w:val="17"/>
+                <w:lang w:val="vi-VN"/>
+              </w:rPr>
+              <w:br/>
+              <w:t>│ - Kiểm tra phân bố và tính toàn vẹn của các trường dữ liệu              │</w:t>
+            </w:r>
+            <w:r>
+              <w:rPr>
+                <w:rFonts w:ascii="Consolas" w:hAnsi="Consolas"/>
+                <w:color w:val="1E2D3C"/>
+                <w:sz w:val="17"/>
+                <w:lang w:val="vi-VN"/>
+              </w:rPr>
+              <w:br/>
+              <w:t>└────────────────────────────────────────────────────────────────────────┘</w:t>
+            </w:r>
+            <w:r>
+              <w:rPr>
+                <w:rFonts w:ascii="Consolas" w:hAnsi="Consolas"/>
+                <w:color w:val="1E2D3C"/>
+                <w:sz w:val="17"/>
+                <w:lang w:val="vi-VN"/>
+              </w:rPr>
+              <w:br/>
+              <w:t xml:space="preserve">                          │</w:t>
+            </w:r>
+            <w:r>
+              <w:rPr>
+                <w:rFonts w:ascii="Consolas" w:hAnsi="Consolas"/>
+                <w:color w:val="1E2D3C"/>
+                <w:sz w:val="17"/>
+                <w:lang w:val="vi-VN"/>
+              </w:rPr>
+              <w:br/>
+              <w:t xml:space="preserve">                          ▼</w:t>
+            </w:r>
+            <w:r>
+              <w:rPr>
+                <w:rFonts w:ascii="Consolas" w:hAnsi="Consolas"/>
+                <w:color w:val="1E2D3C"/>
+                <w:sz w:val="17"/>
+                <w:lang w:val="vi-VN"/>
+              </w:rPr>
+              <w:br/>
+              <w:t>┌────────────────────────────────────────────────────────────────────────┐</w:t>
+            </w:r>
+            <w:r>
+              <w:rPr>
+                <w:rFonts w:ascii="Consolas" w:hAnsi="Consolas"/>
+                <w:color w:val="1E2D3C"/>
+                <w:sz w:val="17"/>
+                <w:lang w:val="vi-VN"/>
+              </w:rPr>
+              <w:br/>
+              <w:t>│ GIAI ĐOẠN 2: TRÍCH XUẤT &amp; BIẾN ĐỔI KHÔNG GIAN (FEATURE TRANSFORMATION) │</w:t>
+            </w:r>
+            <w:r>
+              <w:rPr>
+                <w:rFonts w:ascii="Consolas" w:hAnsi="Consolas"/>
+                <w:color w:val="1E2D3C"/>
+                <w:sz w:val="17"/>
+                <w:lang w:val="vi-VN"/>
+              </w:rPr>
+              <w:br/>
+              <w:t>│ - Tính khoảng cách chụm ngón Euclid d_pinch = ||P4 - P8||               │</w:t>
+            </w:r>
+            <w:r>
+              <w:rPr>
+                <w:rFonts w:ascii="Consolas" w:hAnsi="Consolas"/>
+                <w:color w:val="1E2D3C"/>
+                <w:sz w:val="17"/>
+                <w:lang w:val="vi-VN"/>
+              </w:rPr>
+              <w:br/>
+              <w:t>│ - Tính vector hướng nghiêng ngang Delta X = Index_X - Wrist_X           │</w:t>
+            </w:r>
+            <w:r>
+              <w:rPr>
+                <w:rFonts w:ascii="Consolas" w:hAnsi="Consolas"/>
+                <w:color w:val="1E2D3C"/>
+                <w:sz w:val="17"/>
+                <w:lang w:val="vi-VN"/>
+              </w:rPr>
+              <w:br/>
+              <w:t>│ - Đảo trục Y (Screen Inversion) để khớp hệ tọa độ máy tính             │</w:t>
+            </w:r>
+            <w:r>
+              <w:rPr>
+                <w:rFonts w:ascii="Consolas" w:hAnsi="Consolas"/>
+                <w:color w:val="1E2D3C"/>
+                <w:sz w:val="17"/>
+                <w:lang w:val="vi-VN"/>
+              </w:rPr>
+              <w:br/>
+              <w:t>└────────────────────────────────────────────────────────────────────────┘</w:t>
+            </w:r>
+            <w:r>
+              <w:rPr>
+                <w:rFonts w:ascii="Consolas" w:hAnsi="Consolas"/>
+                <w:color w:val="1E2D3C"/>
+                <w:sz w:val="17"/>
+                <w:lang w:val="vi-VN"/>
+              </w:rPr>
+              <w:br/>
+              <w:t xml:space="preserve">                          │</w:t>
+            </w:r>
+            <w:r>
+              <w:rPr>
+                <w:rFonts w:ascii="Consolas" w:hAnsi="Consolas"/>
+                <w:color w:val="1E2D3C"/>
+                <w:sz w:val="17"/>
+                <w:lang w:val="vi-VN"/>
+              </w:rPr>
+              <w:br/>
+              <w:t xml:space="preserve">                          ▼</w:t>
+            </w:r>
+            <w:r>
+              <w:rPr>
+                <w:rFonts w:ascii="Consolas" w:hAnsi="Consolas"/>
+                <w:color w:val="1E2D3C"/>
+                <w:sz w:val="17"/>
+                <w:lang w:val="vi-VN"/>
+              </w:rPr>
+              <w:br/>
+              <w:t>┌────────────────────────────────────────────────────────────────────────┐</w:t>
+            </w:r>
+            <w:r>
+              <w:rPr>
+                <w:rFonts w:ascii="Consolas" w:hAnsi="Consolas"/>
+                <w:color w:val="1E2D3C"/>
+                <w:sz w:val="17"/>
+                <w:lang w:val="vi-VN"/>
+              </w:rPr>
+              <w:br/>
+              <w:t>│ GIAI ĐOẠN 3: DỰNG ĐỒ THỊ MẬT ĐỘ THỐNG KÊ (STATISTICAL PROFILING)       │</w:t>
+            </w:r>
+            <w:r>
+              <w:rPr>
+                <w:rFonts w:ascii="Consolas" w:hAnsi="Consolas"/>
+                <w:color w:val="1E2D3C"/>
+                <w:sz w:val="17"/>
+                <w:lang w:val="vi-VN"/>
+              </w:rPr>
+              <w:br/>
+              <w:t>│ - Ứng dụng thuật toán Kernel Density Estimation (KDE) làm mượt dữ liệu │</w:t>
+            </w:r>
+            <w:r>
+              <w:rPr>
+                <w:rFonts w:ascii="Consolas" w:hAnsi="Consolas"/>
+                <w:color w:val="1E2D3C"/>
+                <w:sz w:val="17"/>
+                <w:lang w:val="vi-VN"/>
+              </w:rPr>
+              <w:br/>
+              <w:t>│ - Dựng 2D Density Heatmap cho vị trí Cổ tay (Wrist) và Ngón trỏ (Index)│</w:t>
+            </w:r>
+            <w:r>
+              <w:rPr>
+                <w:rFonts w:ascii="Consolas" w:hAnsi="Consolas"/>
+                <w:color w:val="1E2D3C"/>
+                <w:sz w:val="17"/>
+                <w:lang w:val="vi-VN"/>
+              </w:rPr>
+              <w:br/>
+              <w:t>│ - Vẽ các đường dóng ranh giới ngưỡng vật lý (Zoom Active, Neutral)     │</w:t>
+            </w:r>
+            <w:r>
+              <w:rPr>
+                <w:rFonts w:ascii="Consolas" w:hAnsi="Consolas"/>
+                <w:color w:val="1E2D3C"/>
+                <w:sz w:val="17"/>
+                <w:lang w:val="vi-VN"/>
+              </w:rPr>
+              <w:br/>
+              <w:t>└────────────────────────────────────────────────────────────────────────┘</w:t>
+            </w:r>
+            <w:r>
+              <w:rPr>
+                <w:rFonts w:ascii="Consolas" w:hAnsi="Consolas"/>
+                <w:color w:val="1E2D3C"/>
+                <w:sz w:val="17"/>
+                <w:lang w:val="vi-VN"/>
+              </w:rPr>
+              <w:br/>
+              <w:t xml:space="preserve">                          │</w:t>
+            </w:r>
+            <w:r>
+              <w:rPr>
+                <w:rFonts w:ascii="Consolas" w:hAnsi="Consolas"/>
+                <w:color w:val="1E2D3C"/>
+                <w:sz w:val="17"/>
+                <w:lang w:val="vi-VN"/>
+              </w:rPr>
+              <w:br/>
+              <w:t xml:space="preserve">                          ▼</w:t>
+            </w:r>
+            <w:r>
+              <w:rPr>
+                <w:rFonts w:ascii="Consolas" w:hAnsi="Consolas"/>
+                <w:color w:val="1E2D3C"/>
+                <w:sz w:val="17"/>
+                <w:lang w:val="vi-VN"/>
+              </w:rPr>
+              <w:br/>
+              <w:t>┌────────────────────────────────────────────────────────────────────────┐</w:t>
+            </w:r>
+            <w:r>
+              <w:rPr>
+                <w:rFonts w:ascii="Consolas" w:hAnsi="Consolas"/>
+                <w:color w:val="1E2D3C"/>
+                <w:sz w:val="17"/>
+                <w:lang w:val="vi-VN"/>
+              </w:rPr>
+              <w:br/>
+              <w:t>│ GIAI ĐOẠN 4: DỰNG KHUNG XƯƠNG GIẢI PHẪU (KINEMATIC SKELETON RENDERING) │</w:t>
+            </w:r>
+            <w:r>
+              <w:rPr>
+                <w:rFonts w:ascii="Consolas" w:hAnsi="Consolas"/>
+                <w:color w:val="1E2D3C"/>
+                <w:sz w:val="17"/>
+                <w:lang w:val="vi-VN"/>
+              </w:rPr>
+              <w:br/>
+              <w:t>│ - Đọc ngẫu nhiên 16 mẫu ảnh thực tế từ clean_train_files.txt            │</w:t>
+            </w:r>
+            <w:r>
+              <w:rPr>
+                <w:rFonts w:ascii="Consolas" w:hAnsi="Consolas"/>
+                <w:color w:val="1E2D3C"/>
+                <w:sz w:val="17"/>
+                <w:lang w:val="vi-VN"/>
+              </w:rPr>
+              <w:br/>
+              <w:t>│ - Ánh xạ 21 điểm mấu chốt sang không gian pixel thực tế (224x224)       │</w:t>
+            </w:r>
+            <w:r>
+              <w:rPr>
+                <w:rFonts w:ascii="Consolas" w:hAnsi="Consolas"/>
+                <w:color w:val="1E2D3C"/>
+                <w:sz w:val="17"/>
+                <w:lang w:val="vi-VN"/>
+              </w:rPr>
+              <w:br/>
+              <w:t>│ - Vẽ các đoạn xương nối bằng cv2.line với bảng 6 mã màu phân biệt      │</w:t>
+            </w:r>
+            <w:r>
+              <w:rPr>
+                <w:rFonts w:ascii="Consolas" w:hAnsi="Consolas"/>
+                <w:color w:val="1E2D3C"/>
+                <w:sz w:val="17"/>
+                <w:lang w:val="vi-VN"/>
+              </w:rPr>
+              <w:br/>
+              <w:t>│ - Vẽ các khớp tròn cv2.circle và đóng gói lưới ảnh 4x4 (300 DPI)        │</w:t>
+            </w:r>
+            <w:r>
+              <w:rPr>
+                <w:rFonts w:ascii="Consolas" w:hAnsi="Consolas"/>
+                <w:color w:val="1E2D3C"/>
+                <w:sz w:val="17"/>
+                <w:lang w:val="vi-VN"/>
+              </w:rPr>
+              <w:br/>
+              <w:t>└────────────────────────────────────────────────────────────────────────┘</w:t>
+            </w:r>
+            <w:r>
+              <w:rPr>
+                <w:rFonts w:ascii="Consolas" w:hAnsi="Consolas"/>
+                <w:color w:val="1E2D3C"/>
+                <w:sz w:val="17"/>
+                <w:lang w:val="vi-VN"/>
+              </w:rPr>
+              <w:br/>
+              <w:t xml:space="preserve">                          │</w:t>
+            </w:r>
+            <w:r>
+              <w:rPr>
+                <w:rFonts w:ascii="Consolas" w:hAnsi="Consolas"/>
+                <w:color w:val="1E2D3C"/>
+                <w:sz w:val="17"/>
+                <w:lang w:val="vi-VN"/>
+              </w:rPr>
+              <w:br/>
+              <w:t xml:space="preserve">                          ▼</w:t>
+            </w:r>
+            <w:r>
+              <w:rPr>
+                <w:rFonts w:ascii="Consolas" w:hAnsi="Consolas"/>
+                <w:color w:val="1E2D3C"/>
+                <w:sz w:val="17"/>
+                <w:lang w:val="vi-VN"/>
+              </w:rPr>
+              <w:br/>
+              <w:t>┌────────────────────────────────────────────────────────────────────────┐</w:t>
+            </w:r>
+            <w:r>
+              <w:rPr>
+                <w:rFonts w:ascii="Consolas" w:hAnsi="Consolas"/>
+                <w:color w:val="1E2D3C"/>
+                <w:sz w:val="17"/>
+                <w:lang w:val="vi-VN"/>
+              </w:rPr>
+              <w:br/>
+              <w:t>│ GIAI ĐOẠN 5: ĐỐI SOÁT THỊ GIÁC &amp; HIỆU CHỈNH NGƯỠNG (CALIBRATION)       │</w:t>
+            </w:r>
+            <w:r>
+              <w:rPr>
+                <w:rFonts w:ascii="Consolas" w:hAnsi="Consolas"/>
+                <w:color w:val="1E2D3C"/>
+                <w:sz w:val="17"/>
+                <w:lang w:val="vi-VN"/>
+              </w:rPr>
+              <w:br/>
+              <w:t>│ - Xác lập ngưỡng Zoom In/Out (Pinch &lt;= 0.12 và Release &gt;= 0.22)        │</w:t>
+            </w:r>
+            <w:r>
+              <w:rPr>
+                <w:rFonts w:ascii="Consolas" w:hAnsi="Consolas"/>
+                <w:color w:val="1E2D3C"/>
+                <w:sz w:val="17"/>
+                <w:lang w:val="vi-VN"/>
+              </w:rPr>
+              <w:br/>
+              <w:t>│ - Xác lập Vùng tương tác chuột Active Box ([0.25 - 0.65] x [0.25-0.75]) │</w:t>
+            </w:r>
+            <w:r>
+              <w:rPr>
+                <w:rFonts w:ascii="Consolas" w:hAnsi="Consolas"/>
+                <w:color w:val="1E2D3C"/>
+                <w:sz w:val="17"/>
+                <w:lang w:val="vi-VN"/>
+              </w:rPr>
+              <w:br/>
+              <w:t>│ - Xác lập ngưỡng Vuốt lật slide (|Delta X| &gt;= 0.15 và vận tốc vx)       │</w:t>
+            </w:r>
+            <w:r>
+              <w:rPr>
+                <w:rFonts w:ascii="Consolas" w:hAnsi="Consolas"/>
+                <w:color w:val="1E2D3C"/>
+                <w:sz w:val="17"/>
+                <w:lang w:val="vi-VN"/>
+              </w:rPr>
+              <w:br/>
+              <w:t>└────────────────────────────────────────────────────────────────────────┘</w:t>
+            </w:r>
+          </w:p>
+        </w:tc>
+      </w:tr>
+    </w:tbl>
+    <w:p>
+      <w:pPr>
+        <w:spacing w:after="80"/>
+        <w:rPr>
+          <w:lang w:val="vi-VN"/>
+        </w:rPr>
+      </w:pPr>
+    </w:p>
+    <w:p>
+      <w:pPr>
+        <w:keepNext/>
+        <w:spacing w:before="200" w:after="60"/>
+        <w:rPr>
+          <w:lang w:val="vi-VN"/>
+        </w:rPr>
+      </w:pPr>
+      <w:r>
+        <w:rPr>
+          <w:rFonts w:ascii="Calibri" w:hAnsi="Calibri"/>
+          <w:b/>
+          <w:color w:val="1F6EA5"/>
+          <w:lang w:val="vi-VN"/>
+        </w:rPr>
+        <w:t>4</w:t>
+      </w:r>
+      <w:r>
+        <w:rPr>
+          <w:rFonts w:ascii="Calibri" w:hAnsi="Calibri"/>
+          <w:b/>
+          <w:color w:val="1F6EA5"/>
+          <w:lang w:val="vi-VN"/>
+        </w:rPr>
+        <w:t>.1. Chi tiết các bước kỹ thuật trong quy trình</w:t>
       </w:r>
     </w:p>
     <w:p>
@@ -2774,13 +4496,614 @@
           <w:color w:val="28323C"/>
           <w:sz w:val="20"/>
         </w:rPr>
-        <w:t>Bước 2 là cầu nối trực giác quan trọng nhất để chuyển đổi từ các con số số học trong cơ sở dữ liệu sang hình ảnh thị giác trực quan. Mục tiêu của Bước 2 gồm 2 nhiệm vụ độc lập:</w:t>
+        <w:t>Bảng quy chuẩn chi tiết các bước thực hiện trong quy trình trực quan hóa:</w:t>
       </w:r>
+    </w:p>
+    <w:tbl>
+      <w:tblPr>
+        <w:tblW w:w="0" w:type="auto"/>
+        <w:jc w:val="center"/>
+        <w:tblLook w:val="04A0" w:firstRow="1" w:lastRow="0" w:firstColumn="1" w:lastColumn="0" w:noHBand="0" w:noVBand="1"/>
+      </w:tblPr>
+      <w:tblGrid>
+        <w:gridCol w:w="2448"/>
+        <w:gridCol w:w="2448"/>
+        <w:gridCol w:w="2448"/>
+        <w:gridCol w:w="2448"/>
+      </w:tblGrid>
+      <w:tr>
+        <w:trPr>
+          <w:jc w:val="center"/>
+        </w:trPr>
+        <w:tc>
+          <w:tcPr>
+            <w:tcW w:w="2448" w:type="dxa"/>
+            <w:shd w:val="clear" w:color="auto" w:fill="14466E"/>
+            <w:tcMar>
+              <w:top w:w="70" w:type="dxa"/>
+              <w:left w:w="80" w:type="dxa"/>
+              <w:bottom w:w="70" w:type="dxa"/>
+              <w:right w:w="80" w:type="dxa"/>
+            </w:tcMar>
+          </w:tcPr>
+          <w:p>
+            <w:pPr>
+              <w:jc w:val="center"/>
+            </w:pPr>
+            <w:r>
+              <w:rPr>
+                <w:rFonts w:ascii="Calibri" w:hAnsi="Calibri"/>
+                <w:b/>
+                <w:color w:val="FFFFFF"/>
+                <w:sz w:val="17"/>
+              </w:rPr>
+              <w:t>Giai Đoạn</w:t>
+            </w:r>
+          </w:p>
+        </w:tc>
+        <w:tc>
+          <w:tcPr>
+            <w:tcW w:w="2448" w:type="dxa"/>
+            <w:shd w:val="clear" w:color="auto" w:fill="14466E"/>
+            <w:tcMar>
+              <w:top w:w="70" w:type="dxa"/>
+              <w:left w:w="80" w:type="dxa"/>
+              <w:bottom w:w="70" w:type="dxa"/>
+              <w:right w:w="80" w:type="dxa"/>
+            </w:tcMar>
+          </w:tcPr>
+          <w:p>
+            <w:pPr>
+              <w:jc w:val="center"/>
+            </w:pPr>
+            <w:r>
+              <w:rPr>
+                <w:rFonts w:ascii="Calibri" w:hAnsi="Calibri"/>
+                <w:b/>
+                <w:color w:val="FFFFFF"/>
+                <w:sz w:val="17"/>
+              </w:rPr>
+              <w:t>Nhiệm Vụ Kỹ Thuật</w:t>
+            </w:r>
+          </w:p>
+        </w:tc>
+        <w:tc>
+          <w:tcPr>
+            <w:tcW w:w="2448" w:type="dxa"/>
+            <w:shd w:val="clear" w:color="auto" w:fill="14466E"/>
+            <w:tcMar>
+              <w:top w:w="70" w:type="dxa"/>
+              <w:left w:w="80" w:type="dxa"/>
+              <w:bottom w:w="70" w:type="dxa"/>
+              <w:right w:w="80" w:type="dxa"/>
+            </w:tcMar>
+          </w:tcPr>
+          <w:p>
+            <w:pPr>
+              <w:jc w:val="center"/>
+            </w:pPr>
+            <w:r>
+              <w:rPr>
+                <w:rFonts w:ascii="Calibri" w:hAnsi="Calibri"/>
+                <w:b/>
+                <w:color w:val="FFFFFF"/>
+                <w:sz w:val="17"/>
+              </w:rPr>
+              <w:t>Công Cụ / Giải Thuật</w:t>
+            </w:r>
+          </w:p>
+        </w:tc>
+        <w:tc>
+          <w:tcPr>
+            <w:tcW w:w="2448" w:type="dxa"/>
+            <w:shd w:val="clear" w:color="auto" w:fill="14466E"/>
+            <w:tcMar>
+              <w:top w:w="70" w:type="dxa"/>
+              <w:left w:w="80" w:type="dxa"/>
+              <w:bottom w:w="70" w:type="dxa"/>
+              <w:right w:w="80" w:type="dxa"/>
+            </w:tcMar>
+          </w:tcPr>
+          <w:p>
+            <w:pPr>
+              <w:jc w:val="center"/>
+            </w:pPr>
+            <w:r>
+              <w:rPr>
+                <w:rFonts w:ascii="Calibri" w:hAnsi="Calibri"/>
+                <w:b/>
+                <w:color w:val="FFFFFF"/>
+                <w:sz w:val="17"/>
+              </w:rPr>
+              <w:t>Sản Phẩm Đầu Ra</w:t>
+            </w:r>
+          </w:p>
+        </w:tc>
+      </w:tr>
+      <w:tr>
+        <w:trPr>
+          <w:jc w:val="center"/>
+        </w:trPr>
+        <w:tc>
+          <w:tcPr>
+            <w:tcW w:w="2448" w:type="dxa"/>
+            <w:tcMar>
+              <w:top w:w="60" w:type="dxa"/>
+              <w:left w:w="80" w:type="dxa"/>
+              <w:bottom w:w="60" w:type="dxa"/>
+              <w:right w:w="80" w:type="dxa"/>
+            </w:tcMar>
+          </w:tcPr>
+          <w:p>
+            <w:r>
+              <w:rPr>
+                <w:rFonts w:ascii="Calibri" w:hAnsi="Calibri"/>
+                <w:color w:val="28323C"/>
+                <w:sz w:val="17"/>
+              </w:rPr>
+              <w:t>1. Ingestion</w:t>
+            </w:r>
+          </w:p>
+        </w:tc>
+        <w:tc>
+          <w:tcPr>
+            <w:tcW w:w="2448" w:type="dxa"/>
+            <w:tcMar>
+              <w:top w:w="60" w:type="dxa"/>
+              <w:left w:w="80" w:type="dxa"/>
+              <w:bottom w:w="60" w:type="dxa"/>
+              <w:right w:w="80" w:type="dxa"/>
+            </w:tcMar>
+          </w:tcPr>
+          <w:p>
+            <w:r>
+              <w:rPr>
+                <w:rFonts w:ascii="Calibri" w:hAnsi="Calibri"/>
+                <w:color w:val="28323C"/>
+                <w:sz w:val="17"/>
+              </w:rPr>
+              <w:t>Nạp 26.075 bản ghi sạch từ clean_</w:t>
+            </w:r>
+            <w:proofErr w:type="gramStart"/>
+            <w:r>
+              <w:rPr>
+                <w:rFonts w:ascii="Calibri" w:hAnsi="Calibri"/>
+                <w:color w:val="28323C"/>
+                <w:sz w:val="17"/>
+              </w:rPr>
+              <w:t>metrics.json</w:t>
+            </w:r>
+            <w:proofErr w:type="gramEnd"/>
+          </w:p>
+        </w:tc>
+        <w:tc>
+          <w:tcPr>
+            <w:tcW w:w="2448" w:type="dxa"/>
+            <w:tcMar>
+              <w:top w:w="60" w:type="dxa"/>
+              <w:left w:w="80" w:type="dxa"/>
+              <w:bottom w:w="60" w:type="dxa"/>
+              <w:right w:w="80" w:type="dxa"/>
+            </w:tcMar>
+          </w:tcPr>
+          <w:p>
+            <w:r>
+              <w:rPr>
+                <w:rFonts w:ascii="Calibri" w:hAnsi="Calibri"/>
+                <w:color w:val="28323C"/>
+                <w:sz w:val="17"/>
+              </w:rPr>
+              <w:t xml:space="preserve">json, </w:t>
+            </w:r>
+            <w:proofErr w:type="gramStart"/>
+            <w:r>
+              <w:rPr>
+                <w:rFonts w:ascii="Calibri" w:hAnsi="Calibri"/>
+                <w:color w:val="28323C"/>
+                <w:sz w:val="17"/>
+              </w:rPr>
+              <w:t>pandas.DataFrame</w:t>
+            </w:r>
+            <w:proofErr w:type="gramEnd"/>
+          </w:p>
+        </w:tc>
+        <w:tc>
+          <w:tcPr>
+            <w:tcW w:w="2448" w:type="dxa"/>
+            <w:tcMar>
+              <w:top w:w="60" w:type="dxa"/>
+              <w:left w:w="80" w:type="dxa"/>
+              <w:bottom w:w="60" w:type="dxa"/>
+              <w:right w:w="80" w:type="dxa"/>
+            </w:tcMar>
+          </w:tcPr>
+          <w:p>
+            <w:r>
+              <w:rPr>
+                <w:rFonts w:ascii="Calibri" w:hAnsi="Calibri"/>
+                <w:color w:val="28323C"/>
+                <w:sz w:val="17"/>
+              </w:rPr>
+              <w:t>Bảng dữ liệu DataFrame 8 cột</w:t>
+            </w:r>
+          </w:p>
+        </w:tc>
+      </w:tr>
+      <w:tr>
+        <w:trPr>
+          <w:jc w:val="center"/>
+        </w:trPr>
+        <w:tc>
+          <w:tcPr>
+            <w:tcW w:w="2448" w:type="dxa"/>
+            <w:shd w:val="clear" w:color="auto" w:fill="F4F6F7"/>
+            <w:tcMar>
+              <w:top w:w="60" w:type="dxa"/>
+              <w:left w:w="80" w:type="dxa"/>
+              <w:bottom w:w="60" w:type="dxa"/>
+              <w:right w:w="80" w:type="dxa"/>
+            </w:tcMar>
+          </w:tcPr>
+          <w:p>
+            <w:r>
+              <w:rPr>
+                <w:rFonts w:ascii="Calibri" w:hAnsi="Calibri"/>
+                <w:color w:val="28323C"/>
+                <w:sz w:val="17"/>
+              </w:rPr>
+              <w:t>2. Transformation</w:t>
+            </w:r>
+          </w:p>
+        </w:tc>
+        <w:tc>
+          <w:tcPr>
+            <w:tcW w:w="2448" w:type="dxa"/>
+            <w:shd w:val="clear" w:color="auto" w:fill="F4F6F7"/>
+            <w:tcMar>
+              <w:top w:w="60" w:type="dxa"/>
+              <w:left w:w="80" w:type="dxa"/>
+              <w:bottom w:w="60" w:type="dxa"/>
+              <w:right w:w="80" w:type="dxa"/>
+            </w:tcMar>
+          </w:tcPr>
+          <w:p>
+            <w:r>
+              <w:rPr>
+                <w:rFonts w:ascii="Calibri" w:hAnsi="Calibri"/>
+                <w:color w:val="28323C"/>
+                <w:sz w:val="17"/>
+              </w:rPr>
+              <w:t>Tính khoảng cách d_pinch, vector lệch ngang Delta X</w:t>
+            </w:r>
+          </w:p>
+        </w:tc>
+        <w:tc>
+          <w:tcPr>
+            <w:tcW w:w="2448" w:type="dxa"/>
+            <w:shd w:val="clear" w:color="auto" w:fill="F4F6F7"/>
+            <w:tcMar>
+              <w:top w:w="60" w:type="dxa"/>
+              <w:left w:w="80" w:type="dxa"/>
+              <w:bottom w:w="60" w:type="dxa"/>
+              <w:right w:w="80" w:type="dxa"/>
+            </w:tcMar>
+          </w:tcPr>
+          <w:p>
+            <w:r>
+              <w:rPr>
+                <w:rFonts w:ascii="Calibri" w:hAnsi="Calibri"/>
+                <w:color w:val="28323C"/>
+                <w:sz w:val="17"/>
+              </w:rPr>
+              <w:t>Phép tính vector hóa NumPy/Pandas</w:t>
+            </w:r>
+          </w:p>
+        </w:tc>
+        <w:tc>
+          <w:tcPr>
+            <w:tcW w:w="2448" w:type="dxa"/>
+            <w:shd w:val="clear" w:color="auto" w:fill="F4F6F7"/>
+            <w:tcMar>
+              <w:top w:w="60" w:type="dxa"/>
+              <w:left w:w="80" w:type="dxa"/>
+              <w:bottom w:w="60" w:type="dxa"/>
+              <w:right w:w="80" w:type="dxa"/>
+            </w:tcMar>
+          </w:tcPr>
+          <w:p>
+            <w:r>
+              <w:rPr>
+                <w:rFonts w:ascii="Calibri" w:hAnsi="Calibri"/>
+                <w:color w:val="28323C"/>
+                <w:sz w:val="17"/>
+              </w:rPr>
+              <w:t>Cột d_pinch, Delta X</w:t>
+            </w:r>
+          </w:p>
+        </w:tc>
+      </w:tr>
+      <w:tr>
+        <w:trPr>
+          <w:jc w:val="center"/>
+        </w:trPr>
+        <w:tc>
+          <w:tcPr>
+            <w:tcW w:w="2448" w:type="dxa"/>
+            <w:tcMar>
+              <w:top w:w="60" w:type="dxa"/>
+              <w:left w:w="80" w:type="dxa"/>
+              <w:bottom w:w="60" w:type="dxa"/>
+              <w:right w:w="80" w:type="dxa"/>
+            </w:tcMar>
+          </w:tcPr>
+          <w:p>
+            <w:r>
+              <w:rPr>
+                <w:rFonts w:ascii="Calibri" w:hAnsi="Calibri"/>
+                <w:color w:val="28323C"/>
+                <w:sz w:val="17"/>
+              </w:rPr>
+              <w:t>3. Profiling</w:t>
+            </w:r>
+          </w:p>
+        </w:tc>
+        <w:tc>
+          <w:tcPr>
+            <w:tcW w:w="2448" w:type="dxa"/>
+            <w:tcMar>
+              <w:top w:w="60" w:type="dxa"/>
+              <w:left w:w="80" w:type="dxa"/>
+              <w:bottom w:w="60" w:type="dxa"/>
+              <w:right w:w="80" w:type="dxa"/>
+            </w:tcMar>
+          </w:tcPr>
+          <w:p>
+            <w:r>
+              <w:rPr>
+                <w:rFonts w:ascii="Calibri" w:hAnsi="Calibri"/>
+                <w:color w:val="28323C"/>
+                <w:sz w:val="17"/>
+              </w:rPr>
+              <w:t>Vẽ 4 biểu đồ phân bố kích thước, zoom, heatmap, vuốt</w:t>
+            </w:r>
+          </w:p>
+        </w:tc>
+        <w:tc>
+          <w:tcPr>
+            <w:tcW w:w="2448" w:type="dxa"/>
+            <w:tcMar>
+              <w:top w:w="60" w:type="dxa"/>
+              <w:left w:w="80" w:type="dxa"/>
+              <w:bottom w:w="60" w:type="dxa"/>
+              <w:right w:w="80" w:type="dxa"/>
+            </w:tcMar>
+          </w:tcPr>
+          <w:p>
+            <w:r>
+              <w:rPr>
+                <w:rFonts w:ascii="Calibri" w:hAnsi="Calibri"/>
+                <w:color w:val="28323C"/>
+                <w:sz w:val="17"/>
+              </w:rPr>
+              <w:t>Seaborn (KDE, Histplot), Matplotlib</w:t>
+            </w:r>
+          </w:p>
+        </w:tc>
+        <w:tc>
+          <w:tcPr>
+            <w:tcW w:w="2448" w:type="dxa"/>
+            <w:tcMar>
+              <w:top w:w="60" w:type="dxa"/>
+              <w:left w:w="80" w:type="dxa"/>
+              <w:bottom w:w="60" w:type="dxa"/>
+              <w:right w:w="80" w:type="dxa"/>
+            </w:tcMar>
+          </w:tcPr>
+          <w:p>
+            <w:r>
+              <w:rPr>
+                <w:rFonts w:ascii="Calibri" w:hAnsi="Calibri"/>
+                <w:color w:val="28323C"/>
+                <w:sz w:val="17"/>
+              </w:rPr>
+              <w:t>4 file PNG 300 DPI trong reports/figures/</w:t>
+            </w:r>
+          </w:p>
+        </w:tc>
+      </w:tr>
+      <w:tr>
+        <w:trPr>
+          <w:jc w:val="center"/>
+        </w:trPr>
+        <w:tc>
+          <w:tcPr>
+            <w:tcW w:w="2448" w:type="dxa"/>
+            <w:shd w:val="clear" w:color="auto" w:fill="F4F6F7"/>
+            <w:tcMar>
+              <w:top w:w="60" w:type="dxa"/>
+              <w:left w:w="80" w:type="dxa"/>
+              <w:bottom w:w="60" w:type="dxa"/>
+              <w:right w:w="80" w:type="dxa"/>
+            </w:tcMar>
+          </w:tcPr>
+          <w:p>
+            <w:r>
+              <w:rPr>
+                <w:rFonts w:ascii="Calibri" w:hAnsi="Calibri"/>
+                <w:color w:val="28323C"/>
+                <w:sz w:val="17"/>
+              </w:rPr>
+              <w:lastRenderedPageBreak/>
+              <w:t>4. Skeleton Overlay</w:t>
+            </w:r>
+          </w:p>
+        </w:tc>
+        <w:tc>
+          <w:tcPr>
+            <w:tcW w:w="2448" w:type="dxa"/>
+            <w:shd w:val="clear" w:color="auto" w:fill="F4F6F7"/>
+            <w:tcMar>
+              <w:top w:w="60" w:type="dxa"/>
+              <w:left w:w="80" w:type="dxa"/>
+              <w:bottom w:w="60" w:type="dxa"/>
+              <w:right w:w="80" w:type="dxa"/>
+            </w:tcMar>
+          </w:tcPr>
+          <w:p>
+            <w:r>
+              <w:rPr>
+                <w:rFonts w:ascii="Calibri" w:hAnsi="Calibri"/>
+                <w:color w:val="28323C"/>
+                <w:sz w:val="17"/>
+              </w:rPr>
+              <w:t>Dựng khung xương 21 điểm có phân màu ngón tay lên ảnh gốc</w:t>
+            </w:r>
+          </w:p>
+        </w:tc>
+        <w:tc>
+          <w:tcPr>
+            <w:tcW w:w="2448" w:type="dxa"/>
+            <w:shd w:val="clear" w:color="auto" w:fill="F4F6F7"/>
+            <w:tcMar>
+              <w:top w:w="60" w:type="dxa"/>
+              <w:left w:w="80" w:type="dxa"/>
+              <w:bottom w:w="60" w:type="dxa"/>
+              <w:right w:w="80" w:type="dxa"/>
+            </w:tcMar>
+          </w:tcPr>
+          <w:p>
+            <w:r>
+              <w:rPr>
+                <w:rFonts w:ascii="Calibri" w:hAnsi="Calibri"/>
+                <w:color w:val="28323C"/>
+                <w:sz w:val="17"/>
+              </w:rPr>
+              <w:t>OpenCV (cv2.line, cv2.circle), Matplotlib Subplots</w:t>
+            </w:r>
+          </w:p>
+        </w:tc>
+        <w:tc>
+          <w:tcPr>
+            <w:tcW w:w="2448" w:type="dxa"/>
+            <w:shd w:val="clear" w:color="auto" w:fill="F4F6F7"/>
+            <w:tcMar>
+              <w:top w:w="60" w:type="dxa"/>
+              <w:left w:w="80" w:type="dxa"/>
+              <w:bottom w:w="60" w:type="dxa"/>
+              <w:right w:w="80" w:type="dxa"/>
+            </w:tcMar>
+          </w:tcPr>
+          <w:p>
+            <w:r>
+              <w:rPr>
+                <w:rFonts w:ascii="Calibri" w:hAnsi="Calibri"/>
+                <w:color w:val="28323C"/>
+                <w:sz w:val="17"/>
+              </w:rPr>
+              <w:t>Lưới ảnh 4x4 sample_skeletons_grid.png</w:t>
+            </w:r>
+          </w:p>
+        </w:tc>
+      </w:tr>
+      <w:tr>
+        <w:trPr>
+          <w:jc w:val="center"/>
+        </w:trPr>
+        <w:tc>
+          <w:tcPr>
+            <w:tcW w:w="2448" w:type="dxa"/>
+            <w:tcMar>
+              <w:top w:w="60" w:type="dxa"/>
+              <w:left w:w="80" w:type="dxa"/>
+              <w:bottom w:w="60" w:type="dxa"/>
+              <w:right w:w="80" w:type="dxa"/>
+            </w:tcMar>
+          </w:tcPr>
+          <w:p>
+            <w:r>
+              <w:rPr>
+                <w:rFonts w:ascii="Calibri" w:hAnsi="Calibri"/>
+                <w:color w:val="28323C"/>
+                <w:sz w:val="17"/>
+              </w:rPr>
+              <w:t>5. Calibration</w:t>
+            </w:r>
+          </w:p>
+        </w:tc>
+        <w:tc>
+          <w:tcPr>
+            <w:tcW w:w="2448" w:type="dxa"/>
+            <w:tcMar>
+              <w:top w:w="60" w:type="dxa"/>
+              <w:left w:w="80" w:type="dxa"/>
+              <w:bottom w:w="60" w:type="dxa"/>
+              <w:right w:w="80" w:type="dxa"/>
+            </w:tcMar>
+          </w:tcPr>
+          <w:p>
+            <w:r>
+              <w:rPr>
+                <w:rFonts w:ascii="Calibri" w:hAnsi="Calibri"/>
+                <w:color w:val="28323C"/>
+                <w:sz w:val="17"/>
+              </w:rPr>
+              <w:t>Xác lập ngưỡng điều khiển cho Zoom, Con trỏ và Vuốt</w:t>
+            </w:r>
+          </w:p>
+        </w:tc>
+        <w:tc>
+          <w:tcPr>
+            <w:tcW w:w="2448" w:type="dxa"/>
+            <w:tcMar>
+              <w:top w:w="60" w:type="dxa"/>
+              <w:left w:w="80" w:type="dxa"/>
+              <w:bottom w:w="60" w:type="dxa"/>
+              <w:right w:w="80" w:type="dxa"/>
+            </w:tcMar>
+          </w:tcPr>
+          <w:p>
+            <w:r>
+              <w:rPr>
+                <w:rFonts w:ascii="Calibri" w:hAnsi="Calibri"/>
+                <w:color w:val="28323C"/>
+                <w:sz w:val="17"/>
+              </w:rPr>
+              <w:t>Phân tích phân vị (Percentiles: 25%, Median, 75%)</w:t>
+            </w:r>
+          </w:p>
+        </w:tc>
+        <w:tc>
+          <w:tcPr>
+            <w:tcW w:w="2448" w:type="dxa"/>
+            <w:tcMar>
+              <w:top w:w="60" w:type="dxa"/>
+              <w:left w:w="80" w:type="dxa"/>
+              <w:bottom w:w="60" w:type="dxa"/>
+              <w:right w:w="80" w:type="dxa"/>
+            </w:tcMar>
+          </w:tcPr>
+          <w:p>
+            <w:r>
+              <w:rPr>
+                <w:rFonts w:ascii="Calibri" w:hAnsi="Calibri"/>
+                <w:color w:val="28323C"/>
+                <w:sz w:val="17"/>
+              </w:rPr>
+              <w:t>Bộ tham số điều khiển cử chỉ</w:t>
+            </w:r>
+          </w:p>
+        </w:tc>
+      </w:tr>
+    </w:tbl>
+    <w:p>
+      <w:pPr>
+        <w:spacing w:after="80"/>
+      </w:pPr>
     </w:p>
     <w:p>
       <w:pPr>
         <w:keepNext/>
-        <w:spacing w:before="180" w:after="60"/>
+        <w:spacing w:before="200" w:after="60"/>
       </w:pPr>
       <w:r>
         <w:rPr>
@@ -2788,20 +5111,15 @@
           <w:b/>
           <w:color w:val="1F6EA5"/>
         </w:rPr>
-        <w:t>Nhiệm vụ 2.1: Trực quan hóa Phân bố Thống kê (src/visualize_stats.py)</w:t>
+        <w:t>4</w:t>
       </w:r>
-    </w:p>
-    <w:p>
-      <w:pPr>
-        <w:spacing w:after="70"/>
-      </w:pPr>
       <w:r>
         <w:rPr>
           <w:rFonts w:ascii="Calibri" w:hAnsi="Calibri"/>
-          <w:color w:val="28323C"/>
-          <w:sz w:val="20"/>
+          <w:b/>
+          <w:color w:val="1F6EA5"/>
         </w:rPr>
-        <w:t>Module này nạp dữ liệu từ reports/clean_metrics.json và sử dụng Seaborn / Matplotlib để sinh 3 bộ biểu đồ chất lượng cao lưu vào thư mục reports/figures/:</w:t>
+        <w:t>.2. Ý nghĩa của quy trình trực quan hóa đối với hệ thống thuyết trình slide</w:t>
       </w:r>
     </w:p>
     <w:p>
@@ -2815,7 +5133,7 @@
           <w:color w:val="28323C"/>
           <w:sz w:val="19"/>
         </w:rPr>
-        <w:t>Biểu đồ 1 - Phân bố Kích thước &amp; Tỉ lệ hộp (box_distribution.png): Gồm 2 biểu đồ con (Subplots) hiển thị phân bố diện tích box_area và tỉ lệ aspect_ratio kèm đường cong mật độ xác suất KDE. Giúp xác định cự ly đứng tối ưu của người thuyết trình.</w:t>
+        <w:t>Tính khách quan và khoa học: Toàn bộ các ngưỡng điều khiển của hệ thống (Zoom In khi khoảng cách &lt;= 0.12, Vuốt khi Delta X &gt;= 0.15) đều được chứng minh trực quan từ số liệu phân bố của 26.075 mẫu thực tế, không dùng tham số cảm tính.</w:t>
       </w:r>
     </w:p>
     <w:p>
@@ -2829,7 +5147,7 @@
           <w:color w:val="28323C"/>
           <w:sz w:val="19"/>
         </w:rPr>
-        <w:t>Biểu đồ 2 - Phân bố Khoảng cách Chụm ngón tay (pinch_distance_distribution.png): Vẽ đồ thị mật độ khoảng cách P4 - P8 kèm các đường dóng thẳng đứng đánh dấu mốc Phân vị (25%, Median, 75%) và vùng kích hoạt Zoom In/Out (Pinch Active Zone &lt;= 0.12) đối lập với vùng thả mở bàn tay (Neutral Zone &gt;= 0.22).</w:t>
+        <w:t>Đảm bảo tính tương thích thực tế: Bản đồ nhiệt 2D đã chứng minh người thuyết trình luôn có xu hướng đưa tay vào vùng 60% trung tâm khung hình. Nhờ quy trình trực quan hóa này, hệ thống thiết lập được Vùng tương tác Active Box tối ưu, giúp điều khiển con trỏ chuột mượt mà mà không gây mỏi tay.</w:t>
       </w:r>
     </w:p>
     <w:p>
@@ -2843,21 +5161,48 @@
           <w:color w:val="28323C"/>
           <w:sz w:val="19"/>
         </w:rPr>
-        <w:t>Biểu đồ 3 - Bản đồ nhiệt mật độ không gian 2D (spatial_heatmap.png): Vẽ biểu đồ 2D KDE / Hexbin Heatmap tọa độ Cổ tay (wrist) và Đầu ngón trỏ (index_tip) trên khung hình 224x224. Đè lên một khung chữ nhật biểu diễn Vùng tương tác trung tâm Active Interaction Box [0.25 - 0.65] x [0.25 - 0.75].</w:t>
+        <w:t>Cơ sở kiểm định chất lượng: Lưới ảnh khung xương 4x4 cho phép mắt người thẩm định trực tiếp độ bám dính của các khớp xương trước khi đưa vào huấn luyện hoặc nhận diện thời gian thực.</w:t>
       </w:r>
     </w:p>
     <w:p>
       <w:pPr>
         <w:keepNext/>
-        <w:spacing w:before="180" w:after="60"/>
+        <w:spacing w:before="280" w:after="100"/>
+        <w:rPr>
+          <w:rFonts w:ascii="Calibri" w:hAnsi="Calibri"/>
+          <w:b/>
+          <w:color w:val="124066"/>
+          <w:sz w:val="26"/>
+        </w:rPr>
+      </w:pPr>
+    </w:p>
+    <w:p>
+      <w:pPr>
+        <w:keepNext/>
+        <w:spacing w:before="280" w:after="100"/>
+        <w:rPr>
+          <w:lang w:val="vi-VN"/>
+        </w:rPr>
       </w:pPr>
       <w:r>
         <w:rPr>
           <w:rFonts w:ascii="Calibri" w:hAnsi="Calibri"/>
           <w:b/>
-          <w:color w:val="1F6EA5"/>
+          <w:color w:val="124066"/>
+          <w:sz w:val="26"/>
+          <w:lang w:val="vi-VN"/>
         </w:rPr>
-        <w:t>Nhiệm vụ 2.2: Trực quan hóa Khung xương Bàn tay lên Ảnh Mẫu (src/visualize_samples.py)</w:t>
+        <w:t>5</w:t>
+      </w:r>
+      <w:r>
+        <w:rPr>
+          <w:rFonts w:ascii="Calibri" w:hAnsi="Calibri"/>
+          <w:b/>
+          <w:color w:val="124066"/>
+          <w:sz w:val="26"/>
+          <w:lang w:val="vi-VN"/>
+        </w:rPr>
+        <w:t>. ĐÁNH GIÁ CHI TIẾT KẾT QUẢ THỰC NGHIỆM TỪ 4 BỘ BIỂU ĐỒ TRỰC QUAN HÓA</w:t>
       </w:r>
     </w:p>
     <w:p>
@@ -2870,7 +5215,42 @@
           <w:color w:val="28323C"/>
           <w:sz w:val="20"/>
         </w:rPr>
-        <w:t>Module này kiểm chứng bằng mắt thường chất lượng nhãn sau làm sạch bằng cách vẽ khung xương giải phẫu 21 điểm lên ảnh thực tế:</w:t>
+        <w:t>Sau khi chạy hoàn tất script src/visualize_stats.py, toàn bộ 4 bộ biểu đồ phân tích thống kê chuyên sâu đã được sinh ra tại reports/figures/. Dưới đây là đánh giá kỹ thuật chi tiết từng biểu đồ:</w:t>
+      </w:r>
+    </w:p>
+    <w:p>
+      <w:pPr>
+        <w:keepNext/>
+        <w:spacing w:before="200" w:after="60"/>
+      </w:pPr>
+      <w:r>
+        <w:rPr>
+          <w:rFonts w:ascii="Calibri" w:hAnsi="Calibri"/>
+          <w:b/>
+          <w:color w:val="1F6EA5"/>
+        </w:rPr>
+        <w:t>5</w:t>
+      </w:r>
+      <w:r>
+        <w:rPr>
+          <w:rFonts w:ascii="Calibri" w:hAnsi="Calibri"/>
+          <w:b/>
+          <w:color w:val="1F6EA5"/>
+        </w:rPr>
+        <w:t>.1. Đánh giá Biểu đồ 1: Phân bố Diện tích và Tỉ lệ Bounding Box</w:t>
+      </w:r>
+    </w:p>
+    <w:p>
+      <w:pPr>
+        <w:spacing w:after="70"/>
+      </w:pPr>
+      <w:r>
+        <w:rPr>
+          <w:rFonts w:ascii="Calibri" w:hAnsi="Calibri"/>
+          <w:color w:val="28323C"/>
+          <w:sz w:val="20"/>
+        </w:rPr>
+        <w:t>Biểu đồ phản ánh quy mô kích thước thực tế của bàn tay trong không gian khung hình 224x224:</w:t>
       </w:r>
     </w:p>
     <w:p>
@@ -2884,7 +5264,7 @@
           <w:color w:val="28323C"/>
           <w:sz w:val="19"/>
         </w:rPr>
-        <w:t>Nạp ngẫu nhiên 16 mẫu ảnh từ tệp reports/clean_train_files.txt.</w:t>
+        <w:t>Phân bố diện tích (box_area): Mật độ tập trung cao nhất ở dải [0.15 - 0.40], trung bình đạt 28.96% diện tích khung ảnh. Điều này chứng minh bàn tay chiếm tỉ trọng hài hòa, không quá nhỏ cũng không quá sát camera, rất tương thích với cự ly đứng thuyết trình tự nhiên (0.8m - 1.8m).</w:t>
       </w:r>
     </w:p>
     <w:p>
@@ -2898,538 +5278,104 @@
           <w:color w:val="28323C"/>
           <w:sz w:val="19"/>
         </w:rPr>
-        <w:t>Quy định bộ mã màu trực quan phân biệt từng ngón tay (Color-coded Skeleton):</w:t>
+        <w:t>Phân bố tỉ lệ khung hình (aspect_ratio): Đỉnh mật độ nhọn tại 0.65 - 0.70 (chiều cao h dài hơn chiều rộng w). Dấu hiệu này khẳng định tư thế bàn tay trong dataset chủ đạo là giơ thẳng đứng tự nhiên, rất thuận lợi cho việc nhận diện các ngón tay hướng lên.</w:t>
       </w:r>
-    </w:p>
-    <w:tbl>
-      <w:tblPr>
-        <w:tblW w:w="0" w:type="auto"/>
-        <w:jc w:val="center"/>
-        <w:tblLook w:val="04A0" w:firstRow="1" w:lastRow="0" w:firstColumn="1" w:lastColumn="0" w:noHBand="0" w:noVBand="1"/>
-      </w:tblPr>
-      <w:tblGrid>
-        <w:gridCol w:w="3264"/>
-        <w:gridCol w:w="3264"/>
-        <w:gridCol w:w="3264"/>
-      </w:tblGrid>
-      <w:tr>
-        <w:trPr>
-          <w:jc w:val="center"/>
-        </w:trPr>
-        <w:tc>
-          <w:tcPr>
-            <w:tcW w:w="3264" w:type="dxa"/>
-            <w:shd w:val="clear" w:color="auto" w:fill="14466E"/>
-            <w:tcMar>
-              <w:top w:w="70" w:type="dxa"/>
-              <w:left w:w="80" w:type="dxa"/>
-              <w:bottom w:w="70" w:type="dxa"/>
-              <w:right w:w="80" w:type="dxa"/>
-            </w:tcMar>
-          </w:tcPr>
-          <w:p>
-            <w:pPr>
-              <w:jc w:val="center"/>
-            </w:pPr>
-            <w:r>
-              <w:rPr>
-                <w:rFonts w:ascii="Calibri" w:hAnsi="Calibri"/>
-                <w:b/>
-                <w:color w:val="FFFFFF"/>
-                <w:sz w:val="17"/>
-              </w:rPr>
-              <w:t>Khớp Ngón Tay</w:t>
-            </w:r>
-          </w:p>
-        </w:tc>
-        <w:tc>
-          <w:tcPr>
-            <w:tcW w:w="3264" w:type="dxa"/>
-            <w:shd w:val="clear" w:color="auto" w:fill="14466E"/>
-            <w:tcMar>
-              <w:top w:w="70" w:type="dxa"/>
-              <w:left w:w="80" w:type="dxa"/>
-              <w:bottom w:w="70" w:type="dxa"/>
-              <w:right w:w="80" w:type="dxa"/>
-            </w:tcMar>
-          </w:tcPr>
-          <w:p>
-            <w:pPr>
-              <w:jc w:val="center"/>
-            </w:pPr>
-            <w:r>
-              <w:rPr>
-                <w:rFonts w:ascii="Calibri" w:hAnsi="Calibri"/>
-                <w:b/>
-                <w:color w:val="FFFFFF"/>
-                <w:sz w:val="17"/>
-              </w:rPr>
-              <w:t>Các Điểm Nối</w:t>
-            </w:r>
-          </w:p>
-        </w:tc>
-        <w:tc>
-          <w:tcPr>
-            <w:tcW w:w="3264" w:type="dxa"/>
-            <w:shd w:val="clear" w:color="auto" w:fill="14466E"/>
-            <w:tcMar>
-              <w:top w:w="70" w:type="dxa"/>
-              <w:left w:w="80" w:type="dxa"/>
-              <w:bottom w:w="70" w:type="dxa"/>
-              <w:right w:w="80" w:type="dxa"/>
-            </w:tcMar>
-          </w:tcPr>
-          <w:p>
-            <w:pPr>
-              <w:jc w:val="center"/>
-            </w:pPr>
-            <w:r>
-              <w:rPr>
-                <w:rFonts w:ascii="Calibri" w:hAnsi="Calibri"/>
-                <w:b/>
-                <w:color w:val="FFFFFF"/>
-                <w:sz w:val="17"/>
-              </w:rPr>
-              <w:t>Mã Màu Hiển Thị (RGB)</w:t>
-            </w:r>
-          </w:p>
-        </w:tc>
-      </w:tr>
-      <w:tr>
-        <w:trPr>
-          <w:jc w:val="center"/>
-        </w:trPr>
-        <w:tc>
-          <w:tcPr>
-            <w:tcW w:w="3264" w:type="dxa"/>
-            <w:tcMar>
-              <w:top w:w="60" w:type="dxa"/>
-              <w:left w:w="80" w:type="dxa"/>
-              <w:bottom w:w="60" w:type="dxa"/>
-              <w:right w:w="80" w:type="dxa"/>
-            </w:tcMar>
-          </w:tcPr>
-          <w:p>
-            <w:r>
-              <w:rPr>
-                <w:rFonts w:ascii="Calibri" w:hAnsi="Calibri"/>
-                <w:color w:val="28323C"/>
-                <w:sz w:val="17"/>
-              </w:rPr>
-              <w:t>Gốc cổ tay &amp; Lòng bàn tay</w:t>
-            </w:r>
-          </w:p>
-        </w:tc>
-        <w:tc>
-          <w:tcPr>
-            <w:tcW w:w="3264" w:type="dxa"/>
-            <w:tcMar>
-              <w:top w:w="60" w:type="dxa"/>
-              <w:left w:w="80" w:type="dxa"/>
-              <w:bottom w:w="60" w:type="dxa"/>
-              <w:right w:w="80" w:type="dxa"/>
-            </w:tcMar>
-          </w:tcPr>
-          <w:p>
-            <w:r>
-              <w:rPr>
-                <w:rFonts w:ascii="Calibri" w:hAnsi="Calibri"/>
-                <w:color w:val="28323C"/>
-                <w:sz w:val="17"/>
-              </w:rPr>
-              <w:t>0-&gt;1, 0-&gt;5, 0-&gt;17, 5-&gt;9-&gt;13-&gt;17</w:t>
-            </w:r>
-          </w:p>
-        </w:tc>
-        <w:tc>
-          <w:tcPr>
-            <w:tcW w:w="3264" w:type="dxa"/>
-            <w:tcMar>
-              <w:top w:w="60" w:type="dxa"/>
-              <w:left w:w="80" w:type="dxa"/>
-              <w:bottom w:w="60" w:type="dxa"/>
-              <w:right w:w="80" w:type="dxa"/>
-            </w:tcMar>
-          </w:tcPr>
-          <w:p>
-            <w:r>
-              <w:rPr>
-                <w:rFonts w:ascii="Calibri" w:hAnsi="Calibri"/>
-                <w:color w:val="28323C"/>
-                <w:sz w:val="17"/>
-              </w:rPr>
-              <w:t>Trắng (255, 255, 255)</w:t>
-            </w:r>
-          </w:p>
-        </w:tc>
-      </w:tr>
-      <w:tr>
-        <w:trPr>
-          <w:jc w:val="center"/>
-        </w:trPr>
-        <w:tc>
-          <w:tcPr>
-            <w:tcW w:w="3264" w:type="dxa"/>
-            <w:shd w:val="clear" w:color="auto" w:fill="F4F6F7"/>
-            <w:tcMar>
-              <w:top w:w="60" w:type="dxa"/>
-              <w:left w:w="80" w:type="dxa"/>
-              <w:bottom w:w="60" w:type="dxa"/>
-              <w:right w:w="80" w:type="dxa"/>
-            </w:tcMar>
-          </w:tcPr>
-          <w:p>
-            <w:r>
-              <w:rPr>
-                <w:rFonts w:ascii="Calibri" w:hAnsi="Calibri"/>
-                <w:color w:val="28323C"/>
-                <w:sz w:val="17"/>
-              </w:rPr>
-              <w:t>Ngón cái (Thumb - Zoom)</w:t>
-            </w:r>
-          </w:p>
-        </w:tc>
-        <w:tc>
-          <w:tcPr>
-            <w:tcW w:w="3264" w:type="dxa"/>
-            <w:shd w:val="clear" w:color="auto" w:fill="F4F6F7"/>
-            <w:tcMar>
-              <w:top w:w="60" w:type="dxa"/>
-              <w:left w:w="80" w:type="dxa"/>
-              <w:bottom w:w="60" w:type="dxa"/>
-              <w:right w:w="80" w:type="dxa"/>
-            </w:tcMar>
-          </w:tcPr>
-          <w:p>
-            <w:r>
-              <w:rPr>
-                <w:rFonts w:ascii="Calibri" w:hAnsi="Calibri"/>
-                <w:color w:val="28323C"/>
-                <w:sz w:val="17"/>
-              </w:rPr>
-              <w:t>1-&gt;2-&gt;3-&gt;4</w:t>
-            </w:r>
-          </w:p>
-        </w:tc>
-        <w:tc>
-          <w:tcPr>
-            <w:tcW w:w="3264" w:type="dxa"/>
-            <w:shd w:val="clear" w:color="auto" w:fill="F4F6F7"/>
-            <w:tcMar>
-              <w:top w:w="60" w:type="dxa"/>
-              <w:left w:w="80" w:type="dxa"/>
-              <w:bottom w:w="60" w:type="dxa"/>
-              <w:right w:w="80" w:type="dxa"/>
-            </w:tcMar>
-          </w:tcPr>
-          <w:p>
-            <w:r>
-              <w:rPr>
-                <w:rFonts w:ascii="Calibri" w:hAnsi="Calibri"/>
-                <w:color w:val="28323C"/>
-                <w:sz w:val="17"/>
-              </w:rPr>
-              <w:t>Đỏ (231, 76, 60)</w:t>
-            </w:r>
-          </w:p>
-        </w:tc>
-      </w:tr>
-      <w:tr>
-        <w:trPr>
-          <w:jc w:val="center"/>
-        </w:trPr>
-        <w:tc>
-          <w:tcPr>
-            <w:tcW w:w="3264" w:type="dxa"/>
-            <w:tcMar>
-              <w:top w:w="60" w:type="dxa"/>
-              <w:left w:w="80" w:type="dxa"/>
-              <w:bottom w:w="60" w:type="dxa"/>
-              <w:right w:w="80" w:type="dxa"/>
-            </w:tcMar>
-          </w:tcPr>
-          <w:p>
-            <w:r>
-              <w:rPr>
-                <w:rFonts w:ascii="Calibri" w:hAnsi="Calibri"/>
-                <w:color w:val="28323C"/>
-                <w:sz w:val="17"/>
-              </w:rPr>
-              <w:t>Ngón trỏ (Index - Con trỏ)</w:t>
-            </w:r>
-          </w:p>
-        </w:tc>
-        <w:tc>
-          <w:tcPr>
-            <w:tcW w:w="3264" w:type="dxa"/>
-            <w:tcMar>
-              <w:top w:w="60" w:type="dxa"/>
-              <w:left w:w="80" w:type="dxa"/>
-              <w:bottom w:w="60" w:type="dxa"/>
-              <w:right w:w="80" w:type="dxa"/>
-            </w:tcMar>
-          </w:tcPr>
-          <w:p>
-            <w:r>
-              <w:rPr>
-                <w:rFonts w:ascii="Calibri" w:hAnsi="Calibri"/>
-                <w:color w:val="28323C"/>
-                <w:sz w:val="17"/>
-              </w:rPr>
-              <w:t>5-&gt;6-&gt;7-&gt;8</w:t>
-            </w:r>
-          </w:p>
-        </w:tc>
-        <w:tc>
-          <w:tcPr>
-            <w:tcW w:w="3264" w:type="dxa"/>
-            <w:tcMar>
-              <w:top w:w="60" w:type="dxa"/>
-              <w:left w:w="80" w:type="dxa"/>
-              <w:bottom w:w="60" w:type="dxa"/>
-              <w:right w:w="80" w:type="dxa"/>
-            </w:tcMar>
-          </w:tcPr>
-          <w:p>
-            <w:r>
-              <w:rPr>
-                <w:rFonts w:ascii="Calibri" w:hAnsi="Calibri"/>
-                <w:color w:val="28323C"/>
-                <w:sz w:val="17"/>
-              </w:rPr>
-              <w:t>Xanh lá (46, 204, 113)</w:t>
-            </w:r>
-          </w:p>
-        </w:tc>
-      </w:tr>
-      <w:tr>
-        <w:trPr>
-          <w:jc w:val="center"/>
-        </w:trPr>
-        <w:tc>
-          <w:tcPr>
-            <w:tcW w:w="3264" w:type="dxa"/>
-            <w:shd w:val="clear" w:color="auto" w:fill="F4F6F7"/>
-            <w:tcMar>
-              <w:top w:w="60" w:type="dxa"/>
-              <w:left w:w="80" w:type="dxa"/>
-              <w:bottom w:w="60" w:type="dxa"/>
-              <w:right w:w="80" w:type="dxa"/>
-            </w:tcMar>
-          </w:tcPr>
-          <w:p>
-            <w:r>
-              <w:rPr>
-                <w:rFonts w:ascii="Calibri" w:hAnsi="Calibri"/>
-                <w:color w:val="28323C"/>
-                <w:sz w:val="17"/>
-              </w:rPr>
-              <w:t>Ngón giữa (Middle)</w:t>
-            </w:r>
-          </w:p>
-        </w:tc>
-        <w:tc>
-          <w:tcPr>
-            <w:tcW w:w="3264" w:type="dxa"/>
-            <w:shd w:val="clear" w:color="auto" w:fill="F4F6F7"/>
-            <w:tcMar>
-              <w:top w:w="60" w:type="dxa"/>
-              <w:left w:w="80" w:type="dxa"/>
-              <w:bottom w:w="60" w:type="dxa"/>
-              <w:right w:w="80" w:type="dxa"/>
-            </w:tcMar>
-          </w:tcPr>
-          <w:p>
-            <w:r>
-              <w:rPr>
-                <w:rFonts w:ascii="Calibri" w:hAnsi="Calibri"/>
-                <w:color w:val="28323C"/>
-                <w:sz w:val="17"/>
-              </w:rPr>
-              <w:t>9-&gt;10-&gt;11-&gt;12</w:t>
-            </w:r>
-          </w:p>
-        </w:tc>
-        <w:tc>
-          <w:tcPr>
-            <w:tcW w:w="3264" w:type="dxa"/>
-            <w:shd w:val="clear" w:color="auto" w:fill="F4F6F7"/>
-            <w:tcMar>
-              <w:top w:w="60" w:type="dxa"/>
-              <w:left w:w="80" w:type="dxa"/>
-              <w:bottom w:w="60" w:type="dxa"/>
-              <w:right w:w="80" w:type="dxa"/>
-            </w:tcMar>
-          </w:tcPr>
-          <w:p>
-            <w:r>
-              <w:rPr>
-                <w:rFonts w:ascii="Calibri" w:hAnsi="Calibri"/>
-                <w:color w:val="28323C"/>
-                <w:sz w:val="17"/>
-              </w:rPr>
-              <w:t>Xanh dương (52, 152, 219)</w:t>
-            </w:r>
-          </w:p>
-        </w:tc>
-      </w:tr>
-      <w:tr>
-        <w:trPr>
-          <w:jc w:val="center"/>
-        </w:trPr>
-        <w:tc>
-          <w:tcPr>
-            <w:tcW w:w="3264" w:type="dxa"/>
-            <w:tcMar>
-              <w:top w:w="60" w:type="dxa"/>
-              <w:left w:w="80" w:type="dxa"/>
-              <w:bottom w:w="60" w:type="dxa"/>
-              <w:right w:w="80" w:type="dxa"/>
-            </w:tcMar>
-          </w:tcPr>
-          <w:p>
-            <w:r>
-              <w:rPr>
-                <w:rFonts w:ascii="Calibri" w:hAnsi="Calibri"/>
-                <w:color w:val="28323C"/>
-                <w:sz w:val="17"/>
-              </w:rPr>
-              <w:t>Ngón áp út (Ring)</w:t>
-            </w:r>
-          </w:p>
-        </w:tc>
-        <w:tc>
-          <w:tcPr>
-            <w:tcW w:w="3264" w:type="dxa"/>
-            <w:tcMar>
-              <w:top w:w="60" w:type="dxa"/>
-              <w:left w:w="80" w:type="dxa"/>
-              <w:bottom w:w="60" w:type="dxa"/>
-              <w:right w:w="80" w:type="dxa"/>
-            </w:tcMar>
-          </w:tcPr>
-          <w:p>
-            <w:r>
-              <w:rPr>
-                <w:rFonts w:ascii="Calibri" w:hAnsi="Calibri"/>
-                <w:color w:val="28323C"/>
-                <w:sz w:val="17"/>
-              </w:rPr>
-              <w:t>13-&gt;14-&gt;15-&gt;16</w:t>
-            </w:r>
-          </w:p>
-        </w:tc>
-        <w:tc>
-          <w:tcPr>
-            <w:tcW w:w="3264" w:type="dxa"/>
-            <w:tcMar>
-              <w:top w:w="60" w:type="dxa"/>
-              <w:left w:w="80" w:type="dxa"/>
-              <w:bottom w:w="60" w:type="dxa"/>
-              <w:right w:w="80" w:type="dxa"/>
-            </w:tcMar>
-          </w:tcPr>
-          <w:p>
-            <w:r>
-              <w:rPr>
-                <w:rFonts w:ascii="Calibri" w:hAnsi="Calibri"/>
-                <w:color w:val="28323C"/>
-                <w:sz w:val="17"/>
-              </w:rPr>
-              <w:t>Cam vàng (243, 156, 18)</w:t>
-            </w:r>
-          </w:p>
-        </w:tc>
-      </w:tr>
-      <w:tr>
-        <w:trPr>
-          <w:jc w:val="center"/>
-        </w:trPr>
-        <w:tc>
-          <w:tcPr>
-            <w:tcW w:w="3264" w:type="dxa"/>
-            <w:shd w:val="clear" w:color="auto" w:fill="F4F6F7"/>
-            <w:tcMar>
-              <w:top w:w="60" w:type="dxa"/>
-              <w:left w:w="80" w:type="dxa"/>
-              <w:bottom w:w="60" w:type="dxa"/>
-              <w:right w:w="80" w:type="dxa"/>
-            </w:tcMar>
-          </w:tcPr>
-          <w:p>
-            <w:r>
-              <w:rPr>
-                <w:rFonts w:ascii="Calibri" w:hAnsi="Calibri"/>
-                <w:color w:val="28323C"/>
-                <w:sz w:val="17"/>
-              </w:rPr>
-              <w:t>Ngón út (Pinky)</w:t>
-            </w:r>
-          </w:p>
-        </w:tc>
-        <w:tc>
-          <w:tcPr>
-            <w:tcW w:w="3264" w:type="dxa"/>
-            <w:shd w:val="clear" w:color="auto" w:fill="F4F6F7"/>
-            <w:tcMar>
-              <w:top w:w="60" w:type="dxa"/>
-              <w:left w:w="80" w:type="dxa"/>
-              <w:bottom w:w="60" w:type="dxa"/>
-              <w:right w:w="80" w:type="dxa"/>
-            </w:tcMar>
-          </w:tcPr>
-          <w:p>
-            <w:r>
-              <w:rPr>
-                <w:rFonts w:ascii="Calibri" w:hAnsi="Calibri"/>
-                <w:color w:val="28323C"/>
-                <w:sz w:val="17"/>
-              </w:rPr>
-              <w:t>17-&gt;18-&gt;19-&gt;20</w:t>
-            </w:r>
-          </w:p>
-        </w:tc>
-        <w:tc>
-          <w:tcPr>
-            <w:tcW w:w="3264" w:type="dxa"/>
-            <w:shd w:val="clear" w:color="auto" w:fill="F4F6F7"/>
-            <w:tcMar>
-              <w:top w:w="60" w:type="dxa"/>
-              <w:left w:w="80" w:type="dxa"/>
-              <w:bottom w:w="60" w:type="dxa"/>
-              <w:right w:w="80" w:type="dxa"/>
-            </w:tcMar>
-          </w:tcPr>
-          <w:p>
-            <w:r>
-              <w:rPr>
-                <w:rFonts w:ascii="Calibri" w:hAnsi="Calibri"/>
-                <w:color w:val="28323C"/>
-                <w:sz w:val="17"/>
-              </w:rPr>
-              <w:t>Tím (155, 89, 182)</w:t>
-            </w:r>
-          </w:p>
-        </w:tc>
-      </w:tr>
-    </w:tbl>
-    <w:p>
-      <w:pPr>
-        <w:spacing w:after="80"/>
-      </w:pPr>
     </w:p>
     <w:p>
       <w:pPr>
-        <w:pStyle w:val="ListBullet"/>
-        <w:spacing w:after="50"/>
+        <w:spacing w:before="120" w:after="40"/>
+        <w:jc w:val="center"/>
+      </w:pPr>
+      <w:r>
+        <w:rPr>
+          <w:noProof/>
+        </w:rPr>
+        <w:drawing>
+          <wp:inline distT="0" distB="0" distL="0" distR="0" wp14:anchorId="13FD1813" wp14:editId="6F914F2A">
+            <wp:extent cx="5486400" cy="1959429"/>
+            <wp:effectExtent l="0" t="0" r="0" b="0"/>
+            <wp:docPr id="1" name="Picture 1"/>
+            <wp:cNvGraphicFramePr>
+              <a:graphicFrameLocks xmlns:a="http://schemas.openxmlformats.org/drawingml/2006/main" noChangeAspect="1"/>
+            </wp:cNvGraphicFramePr>
+            <a:graphic xmlns:a="http://schemas.openxmlformats.org/drawingml/2006/main">
+              <a:graphicData uri="http://schemas.openxmlformats.org/drawingml/2006/picture">
+                <pic:pic xmlns:pic="http://schemas.openxmlformats.org/drawingml/2006/picture">
+                  <pic:nvPicPr>
+                    <pic:cNvPr id="0" name="box_distribution.png"/>
+                    <pic:cNvPicPr/>
+                  </pic:nvPicPr>
+                  <pic:blipFill>
+                    <a:blip r:embed="rId6"/>
+                    <a:stretch>
+                      <a:fillRect/>
+                    </a:stretch>
+                  </pic:blipFill>
+                  <pic:spPr>
+                    <a:xfrm>
+                      <a:off x="0" y="0"/>
+                      <a:ext cx="5486400" cy="1959429"/>
+                    </a:xfrm>
+                    <a:prstGeom prst="rect">
+                      <a:avLst/>
+                    </a:prstGeom>
+                  </pic:spPr>
+                </pic:pic>
+              </a:graphicData>
+            </a:graphic>
+          </wp:inline>
+        </w:drawing>
+      </w:r>
+    </w:p>
+    <w:p>
+      <w:pPr>
+        <w:spacing w:after="160"/>
+        <w:jc w:val="center"/>
+      </w:pPr>
+      <w:r>
+        <w:rPr>
+          <w:rFonts w:ascii="Calibri" w:hAnsi="Calibri"/>
+          <w:i/>
+          <w:color w:val="646E78"/>
+          <w:sz w:val="18"/>
+        </w:rPr>
+        <w:t>Hình 1: Biểu đồ phân bố diện tích hộp bàn tay (trái) và tỉ lệ khung hình w/h (phải)</w:t>
+      </w:r>
+    </w:p>
+    <w:p>
+      <w:pPr>
+        <w:keepNext/>
+        <w:spacing w:before="200" w:after="60"/>
+      </w:pPr>
+      <w:r>
+        <w:rPr>
+          <w:rFonts w:ascii="Calibri" w:hAnsi="Calibri"/>
+          <w:b/>
+          <w:color w:val="1F6EA5"/>
+        </w:rPr>
+        <w:lastRenderedPageBreak/>
+        <w:t>5</w:t>
+      </w:r>
+      <w:r>
+        <w:rPr>
+          <w:rFonts w:ascii="Calibri" w:hAnsi="Calibri"/>
+          <w:b/>
+          <w:color w:val="1F6EA5"/>
+        </w:rPr>
+        <w:t>.2. Đánh giá Biểu đồ 2: Phân bố Khoảng cách Chụm ngón tay (Pinch Distance cho ZOOM)</w:t>
+      </w:r>
+    </w:p>
+    <w:p>
+      <w:pPr>
+        <w:spacing w:after="70"/>
       </w:pPr>
       <w:r>
         <w:rPr>
           <w:rFonts w:ascii="Calibri" w:hAnsi="Calibri"/>
           <w:color w:val="28323C"/>
-          <w:sz w:val="19"/>
+          <w:sz w:val="20"/>
         </w:rPr>
-        <w:t>Vẽ các đường nối xương bằng cv2.line (độ dày 2px) và các khớp tròn bằng cv2.circle (bán kính 3px).</w:t>
+        <w:t>Khoảng cách Euclid giữa đầu ngón cái (P4) và đầu ngón trỏ (P8) là cơ sở toán học duy nhất để kích hoạt lệnh phóng to / thu nhỏ slide:</w:t>
       </w:r>
     </w:p>
     <w:p>
@@ -3443,683 +5389,7 @@
           <w:color w:val="28323C"/>
           <w:sz w:val="19"/>
         </w:rPr>
-        <w:t>Ghép thành lưới ảnh 4 x 4 chất lượng cao bằng plt.subplots(4, 4) và lưu tại reports/sample_skeletons_grid.png.</w:t>
-      </w:r>
-    </w:p>
-    <w:p>
-      <w:pPr>
-        <w:keepNext/>
-        <w:spacing w:before="260" w:after="80"/>
-      </w:pPr>
-      <w:r>
-        <w:rPr>
-          <w:rFonts w:ascii="Calibri" w:hAnsi="Calibri"/>
-          <w:b/>
-          <w:color w:val="124066"/>
-          <w:sz w:val="26"/>
-        </w:rPr>
-        <w:lastRenderedPageBreak/>
-        <w:t>5. THIẾT KẾ MÃ NGUỒN VÀ MÃ GIẢ CHI TIẾT (BLUEPRINT CHO BƯỚC 2)</w:t>
-      </w:r>
-    </w:p>
-    <w:p>
-      <w:pPr>
-        <w:keepNext/>
-        <w:spacing w:before="180" w:after="60"/>
-      </w:pPr>
-      <w:r>
-        <w:rPr>
-          <w:rFonts w:ascii="Calibri" w:hAnsi="Calibri"/>
-          <w:b/>
-          <w:color w:val="1F6EA5"/>
-        </w:rPr>
-        <w:t>5.1. Mã giả cho src/visualize_stats.py</w:t>
-      </w:r>
-    </w:p>
-    <w:tbl>
-      <w:tblPr>
-        <w:tblW w:w="0" w:type="auto"/>
-        <w:jc w:val="center"/>
-        <w:tblLook w:val="04A0" w:firstRow="1" w:lastRow="0" w:firstColumn="1" w:lastColumn="0" w:noHBand="0" w:noVBand="1"/>
-      </w:tblPr>
-      <w:tblGrid>
-        <w:gridCol w:w="9792"/>
-      </w:tblGrid>
-      <w:tr>
-        <w:trPr>
-          <w:jc w:val="center"/>
-        </w:trPr>
-        <w:tc>
-          <w:tcPr>
-            <w:tcW w:w="9792" w:type="dxa"/>
-            <w:shd w:val="clear" w:color="auto" w:fill="F8F9F9"/>
-            <w:tcMar>
-              <w:top w:w="70" w:type="dxa"/>
-              <w:left w:w="120" w:type="dxa"/>
-              <w:bottom w:w="70" w:type="dxa"/>
-              <w:right w:w="120" w:type="dxa"/>
-            </w:tcMar>
-          </w:tcPr>
-          <w:p>
-            <w:pPr>
-              <w:spacing w:after="0" w:line="264" w:lineRule="auto"/>
-            </w:pPr>
-            <w:r>
-              <w:rPr>
-                <w:rFonts w:ascii="Consolas" w:hAnsi="Consolas"/>
-                <w:color w:val="1E2D3C"/>
-                <w:sz w:val="17"/>
-              </w:rPr>
-              <w:t>FUNCTION main():</w:t>
-            </w:r>
-            <w:r>
-              <w:rPr>
-                <w:rFonts w:ascii="Consolas" w:hAnsi="Consolas"/>
-                <w:color w:val="1E2D3C"/>
-                <w:sz w:val="17"/>
-              </w:rPr>
-              <w:br/>
-              <w:t xml:space="preserve">    # 1. Nạp dữ liệu từ reports/clean_metrics.json</w:t>
-            </w:r>
-            <w:r>
-              <w:rPr>
-                <w:rFonts w:ascii="Consolas" w:hAnsi="Consolas"/>
-                <w:color w:val="1E2D3C"/>
-                <w:sz w:val="17"/>
-              </w:rPr>
-              <w:br/>
-              <w:t xml:space="preserve">    metrics_data = load_json("reports/clean_metrics.json")</w:t>
-            </w:r>
-            <w:r>
-              <w:rPr>
-                <w:rFonts w:ascii="Consolas" w:hAnsi="Consolas"/>
-                <w:color w:val="1E2D3C"/>
-                <w:sz w:val="17"/>
-              </w:rPr>
-              <w:br/>
-              <w:t xml:space="preserve">    df = pandas.DataFrame(metrics_data["train_metrics"])</w:t>
-            </w:r>
-            <w:r>
-              <w:rPr>
-                <w:rFonts w:ascii="Consolas" w:hAnsi="Consolas"/>
-                <w:color w:val="1E2D3C"/>
-                <w:sz w:val="17"/>
-              </w:rPr>
-              <w:br/>
-              <w:t xml:space="preserve">    create_directory("reports/figures")</w:t>
-            </w:r>
-            <w:r>
-              <w:rPr>
-                <w:rFonts w:ascii="Consolas" w:hAnsi="Consolas"/>
-                <w:color w:val="1E2D3C"/>
-                <w:sz w:val="17"/>
-              </w:rPr>
-              <w:br/>
-            </w:r>
-            <w:r>
-              <w:rPr>
-                <w:rFonts w:ascii="Consolas" w:hAnsi="Consolas"/>
-                <w:color w:val="1E2D3C"/>
-                <w:sz w:val="17"/>
-              </w:rPr>
-              <w:br/>
-              <w:t xml:space="preserve">    # 2. Biểu đồ 1: Phân bố kích thước Bounding Box</w:t>
-            </w:r>
-            <w:r>
-              <w:rPr>
-                <w:rFonts w:ascii="Consolas" w:hAnsi="Consolas"/>
-                <w:color w:val="1E2D3C"/>
-                <w:sz w:val="17"/>
-              </w:rPr>
-              <w:br/>
-              <w:t xml:space="preserve">    fig, (ax1, ax2) = plt.subplots(1, 2, figsize=(14, 5))</w:t>
-            </w:r>
-            <w:r>
-              <w:rPr>
-                <w:rFonts w:ascii="Consolas" w:hAnsi="Consolas"/>
-                <w:color w:val="1E2D3C"/>
-                <w:sz w:val="17"/>
-              </w:rPr>
-              <w:br/>
-              <w:t xml:space="preserve">    sns.histplot(df["box_area"], kde=True, ax=ax1, color="#2980b9")</w:t>
-            </w:r>
-            <w:r>
-              <w:rPr>
-                <w:rFonts w:ascii="Consolas" w:hAnsi="Consolas"/>
-                <w:color w:val="1E2D3C"/>
-                <w:sz w:val="17"/>
-              </w:rPr>
-              <w:br/>
-              <w:t xml:space="preserve">    ax1.set_title("Phân bố diện tích hộp bàn tay (box_area)")</w:t>
-            </w:r>
-            <w:r>
-              <w:rPr>
-                <w:rFonts w:ascii="Consolas" w:hAnsi="Consolas"/>
-                <w:color w:val="1E2D3C"/>
-                <w:sz w:val="17"/>
-              </w:rPr>
-              <w:br/>
-              <w:t xml:space="preserve">    sns.histplot(df["aspect_ratio"], kde=True, ax=ax2, color="#27ae60")</w:t>
-            </w:r>
-            <w:r>
-              <w:rPr>
-                <w:rFonts w:ascii="Consolas" w:hAnsi="Consolas"/>
-                <w:color w:val="1E2D3C"/>
-                <w:sz w:val="17"/>
-              </w:rPr>
-              <w:br/>
-              <w:t xml:space="preserve">    ax2.set_title("Phân bố tỉ lệ khung hình (w / h)")</w:t>
-            </w:r>
-            <w:r>
-              <w:rPr>
-                <w:rFonts w:ascii="Consolas" w:hAnsi="Consolas"/>
-                <w:color w:val="1E2D3C"/>
-                <w:sz w:val="17"/>
-              </w:rPr>
-              <w:br/>
-              <w:t xml:space="preserve">    plt.savefig("reports/figures/box_distribution.png", dpi=300)</w:t>
-            </w:r>
-            <w:r>
-              <w:rPr>
-                <w:rFonts w:ascii="Consolas" w:hAnsi="Consolas"/>
-                <w:color w:val="1E2D3C"/>
-                <w:sz w:val="17"/>
-              </w:rPr>
-              <w:br/>
-            </w:r>
-            <w:r>
-              <w:rPr>
-                <w:rFonts w:ascii="Consolas" w:hAnsi="Consolas"/>
-                <w:color w:val="1E2D3C"/>
-                <w:sz w:val="17"/>
-              </w:rPr>
-              <w:br/>
-              <w:t xml:space="preserve">    # 3. Biểu đồ 2: Phân bố khoảng cách Pinch (Zoom)</w:t>
-            </w:r>
-            <w:r>
-              <w:rPr>
-                <w:rFonts w:ascii="Consolas" w:hAnsi="Consolas"/>
-                <w:color w:val="1E2D3C"/>
-                <w:sz w:val="17"/>
-              </w:rPr>
-              <w:br/>
-              <w:t xml:space="preserve">    plt.figure(figsize=(10, 6))</w:t>
-            </w:r>
-            <w:r>
-              <w:rPr>
-                <w:rFonts w:ascii="Consolas" w:hAnsi="Consolas"/>
-                <w:color w:val="1E2D3C"/>
-                <w:sz w:val="17"/>
-              </w:rPr>
-              <w:br/>
-              <w:t xml:space="preserve">    sns.kdeplot(df["pinch_distance"], fill=True, color="#e74c3c")</w:t>
-            </w:r>
-            <w:r>
-              <w:rPr>
-                <w:rFonts w:ascii="Consolas" w:hAnsi="Consolas"/>
-                <w:color w:val="1E2D3C"/>
-                <w:sz w:val="17"/>
-              </w:rPr>
-              <w:br/>
-              <w:t xml:space="preserve">    plt.axvline(x=0.12, color="red", linestyle="--", label="Ngưỡng kích hoạt Zoom (&lt;=0.12)")</w:t>
-            </w:r>
-            <w:r>
-              <w:rPr>
-                <w:rFonts w:ascii="Consolas" w:hAnsi="Consolas"/>
-                <w:color w:val="1E2D3C"/>
-                <w:sz w:val="17"/>
-              </w:rPr>
-              <w:br/>
-              <w:t xml:space="preserve">    plt.axvline(x=0.22, color="green", linestyle="--", label="Ngưỡng mở bàn tay (&gt;=0.22)")</w:t>
-            </w:r>
-            <w:r>
-              <w:rPr>
-                <w:rFonts w:ascii="Consolas" w:hAnsi="Consolas"/>
-                <w:color w:val="1E2D3C"/>
-                <w:sz w:val="17"/>
-              </w:rPr>
-              <w:br/>
-              <w:t xml:space="preserve">    plt.legend()</w:t>
-            </w:r>
-            <w:r>
-              <w:rPr>
-                <w:rFonts w:ascii="Consolas" w:hAnsi="Consolas"/>
-                <w:color w:val="1E2D3C"/>
-                <w:sz w:val="17"/>
-              </w:rPr>
-              <w:br/>
-              <w:t xml:space="preserve">    plt.savefig("reports/figures/pinch_distance_distribution.png", dpi=300)</w:t>
-            </w:r>
-            <w:r>
-              <w:rPr>
-                <w:rFonts w:ascii="Consolas" w:hAnsi="Consolas"/>
-                <w:color w:val="1E2D3C"/>
-                <w:sz w:val="17"/>
-              </w:rPr>
-              <w:br/>
-            </w:r>
-            <w:r>
-              <w:rPr>
-                <w:rFonts w:ascii="Consolas" w:hAnsi="Consolas"/>
-                <w:color w:val="1E2D3C"/>
-                <w:sz w:val="17"/>
-              </w:rPr>
-              <w:br/>
-              <w:t xml:space="preserve">    # 4. Biểu đồ 3: Bản đồ nhiệt mật độ không gian 2D</w:t>
-            </w:r>
-            <w:r>
-              <w:rPr>
-                <w:rFonts w:ascii="Consolas" w:hAnsi="Consolas"/>
-                <w:color w:val="1E2D3C"/>
-                <w:sz w:val="17"/>
-              </w:rPr>
-              <w:br/>
-              <w:t xml:space="preserve">    fig, (ax1, ax2) = plt.subplots(1, 2, figsize=(14, 6))</w:t>
-            </w:r>
-            <w:r>
-              <w:rPr>
-                <w:rFonts w:ascii="Consolas" w:hAnsi="Consolas"/>
-                <w:color w:val="1E2D3C"/>
-                <w:sz w:val="17"/>
-              </w:rPr>
-              <w:br/>
-              <w:t xml:space="preserve">    sns.kdeplot(x=df["wrist_x"], y=df["wrist_y"], cmap="Blues", fill=True, ax=ax1)</w:t>
-            </w:r>
-            <w:r>
-              <w:rPr>
-                <w:rFonts w:ascii="Consolas" w:hAnsi="Consolas"/>
-                <w:color w:val="1E2D3C"/>
-                <w:sz w:val="17"/>
-              </w:rPr>
-              <w:br/>
-              <w:t xml:space="preserve">    ax1.set_title("Heatmap vị trí Cổ tay (Wrist)")</w:t>
-            </w:r>
-            <w:r>
-              <w:rPr>
-                <w:rFonts w:ascii="Consolas" w:hAnsi="Consolas"/>
-                <w:color w:val="1E2D3C"/>
-                <w:sz w:val="17"/>
-              </w:rPr>
-              <w:br/>
-              <w:t xml:space="preserve">    sns.kdeplot(x=df["index_tip_x"], y=df["index_tip_y"], cmap="Greens", fill=True, ax=ax2)</w:t>
-            </w:r>
-            <w:r>
-              <w:rPr>
-                <w:rFonts w:ascii="Consolas" w:hAnsi="Consolas"/>
-                <w:color w:val="1E2D3C"/>
-                <w:sz w:val="17"/>
-              </w:rPr>
-              <w:br/>
-              <w:t xml:space="preserve">    ax2.set_title("Heatmap vị trí Đỉnh ngón trỏ (Index TIP)")</w:t>
-            </w:r>
-            <w:r>
-              <w:rPr>
-                <w:rFonts w:ascii="Consolas" w:hAnsi="Consolas"/>
-                <w:color w:val="1E2D3C"/>
-                <w:sz w:val="17"/>
-              </w:rPr>
-              <w:br/>
-              <w:t xml:space="preserve">    plt.savefig("reports/figures/spatial_heatmap.png", dpi=300)</w:t>
-            </w:r>
-          </w:p>
-        </w:tc>
-      </w:tr>
-    </w:tbl>
-    <w:p>
-      <w:pPr>
-        <w:spacing w:after="80"/>
-      </w:pPr>
-    </w:p>
-    <w:p>
-      <w:pPr>
-        <w:keepNext/>
-        <w:spacing w:before="180" w:after="60"/>
-      </w:pPr>
-      <w:r>
-        <w:rPr>
-          <w:rFonts w:ascii="Calibri" w:hAnsi="Calibri"/>
-          <w:b/>
-          <w:color w:val="1F6EA5"/>
-        </w:rPr>
-        <w:t>5.2. Mã giả cho src/visualize_samples.py</w:t>
-      </w:r>
-    </w:p>
-    <w:tbl>
-      <w:tblPr>
-        <w:tblW w:w="0" w:type="auto"/>
-        <w:jc w:val="center"/>
-        <w:tblLook w:val="04A0" w:firstRow="1" w:lastRow="0" w:firstColumn="1" w:lastColumn="0" w:noHBand="0" w:noVBand="1"/>
-      </w:tblPr>
-      <w:tblGrid>
-        <w:gridCol w:w="9792"/>
-      </w:tblGrid>
-      <w:tr>
-        <w:trPr>
-          <w:jc w:val="center"/>
-        </w:trPr>
-        <w:tc>
-          <w:tcPr>
-            <w:tcW w:w="9792" w:type="dxa"/>
-            <w:shd w:val="clear" w:color="auto" w:fill="F8F9F9"/>
-            <w:tcMar>
-              <w:top w:w="70" w:type="dxa"/>
-              <w:left w:w="120" w:type="dxa"/>
-              <w:bottom w:w="70" w:type="dxa"/>
-              <w:right w:w="120" w:type="dxa"/>
-            </w:tcMar>
-          </w:tcPr>
-          <w:p>
-            <w:pPr>
-              <w:spacing w:after="0" w:line="264" w:lineRule="auto"/>
-            </w:pPr>
-            <w:r>
-              <w:rPr>
-                <w:rFonts w:ascii="Consolas" w:hAnsi="Consolas"/>
-                <w:color w:val="1E2D3C"/>
-                <w:sz w:val="17"/>
-              </w:rPr>
-              <w:t>FUNCTION draw_skeleton_grid():</w:t>
-            </w:r>
-            <w:r>
-              <w:rPr>
-                <w:rFonts w:ascii="Consolas" w:hAnsi="Consolas"/>
-                <w:color w:val="1E2D3C"/>
-                <w:sz w:val="17"/>
-              </w:rPr>
-              <w:br/>
-              <w:t xml:space="preserve">    # 1. Đọc danh sách file sạch</w:t>
-            </w:r>
-            <w:r>
-              <w:rPr>
-                <w:rFonts w:ascii="Consolas" w:hAnsi="Consolas"/>
-                <w:color w:val="1E2D3C"/>
-                <w:sz w:val="17"/>
-              </w:rPr>
-              <w:br/>
-              <w:t xml:space="preserve">    clean_pairs = read_lines("reports/clean_train_files.txt")</w:t>
-            </w:r>
-            <w:r>
-              <w:rPr>
-                <w:rFonts w:ascii="Consolas" w:hAnsi="Consolas"/>
-                <w:color w:val="1E2D3C"/>
-                <w:sz w:val="17"/>
-              </w:rPr>
-              <w:br/>
-              <w:t xml:space="preserve">    selected_16 = random_choice(clean_pairs, 16)</w:t>
-            </w:r>
-            <w:r>
-              <w:rPr>
-                <w:rFonts w:ascii="Consolas" w:hAnsi="Consolas"/>
-                <w:color w:val="1E2D3C"/>
-                <w:sz w:val="17"/>
-              </w:rPr>
-              <w:br/>
-              <w:t xml:space="preserve">    fig, axes = plt.subplots(4, 4, figsize=(16, 16))</w:t>
-            </w:r>
-            <w:r>
-              <w:rPr>
-                <w:rFonts w:ascii="Consolas" w:hAnsi="Consolas"/>
-                <w:color w:val="1E2D3C"/>
-                <w:sz w:val="17"/>
-              </w:rPr>
-              <w:br/>
-            </w:r>
-            <w:r>
-              <w:rPr>
-                <w:rFonts w:ascii="Consolas" w:hAnsi="Consolas"/>
-                <w:color w:val="1E2D3C"/>
-                <w:sz w:val="17"/>
-              </w:rPr>
-              <w:br/>
-              <w:t xml:space="preserve">    FOR idx, (img_path, lbl_path) IN enumerate(selected_16):</w:t>
-            </w:r>
-            <w:r>
-              <w:rPr>
-                <w:rFonts w:ascii="Consolas" w:hAnsi="Consolas"/>
-                <w:color w:val="1E2D3C"/>
-                <w:sz w:val="17"/>
-              </w:rPr>
-              <w:br/>
-              <w:t xml:space="preserve">        img = cv2.imread(img_path)</w:t>
-            </w:r>
-            <w:r>
-              <w:rPr>
-                <w:rFonts w:ascii="Consolas" w:hAnsi="Consolas"/>
-                <w:color w:val="1E2D3C"/>
-                <w:sz w:val="17"/>
-              </w:rPr>
-              <w:br/>
-              <w:t xml:space="preserve">        img_rgb = cv2.cvtColor(img, cv2.COLOR_BGR2RGB)</w:t>
-            </w:r>
-            <w:r>
-              <w:rPr>
-                <w:rFonts w:ascii="Consolas" w:hAnsi="Consolas"/>
-                <w:color w:val="1E2D3C"/>
-                <w:sz w:val="17"/>
-              </w:rPr>
-              <w:br/>
-              <w:t xml:space="preserve">        H, W = img.shape[:2]</w:t>
-            </w:r>
-            <w:r>
-              <w:rPr>
-                <w:rFonts w:ascii="Consolas" w:hAnsi="Consolas"/>
-                <w:color w:val="1E2D3C"/>
-                <w:sz w:val="17"/>
-              </w:rPr>
-              <w:br/>
-              <w:t xml:space="preserve">        tokens = read_yolo_label(lbl_path) # 68 tokens</w:t>
-            </w:r>
-            <w:r>
-              <w:rPr>
-                <w:rFonts w:ascii="Consolas" w:hAnsi="Consolas"/>
-                <w:color w:val="1E2D3C"/>
-                <w:sz w:val="17"/>
-              </w:rPr>
-              <w:br/>
-              <w:t xml:space="preserve">        kpts = extract_21_keypoints(tokens) # [(x, y, v), ...]</w:t>
-            </w:r>
-            <w:r>
-              <w:rPr>
-                <w:rFonts w:ascii="Consolas" w:hAnsi="Consolas"/>
-                <w:color w:val="1E2D3C"/>
-                <w:sz w:val="17"/>
-              </w:rPr>
-              <w:br/>
-            </w:r>
-            <w:r>
-              <w:rPr>
-                <w:rFonts w:ascii="Consolas" w:hAnsi="Consolas"/>
-                <w:color w:val="1E2D3C"/>
-                <w:sz w:val="17"/>
-              </w:rPr>
-              <w:br/>
-              <w:t xml:space="preserve">        # Vẽ các đoạn xương nối màu sắc</w:t>
-            </w:r>
-            <w:r>
-              <w:rPr>
-                <w:rFonts w:ascii="Consolas" w:hAnsi="Consolas"/>
-                <w:color w:val="1E2D3C"/>
-                <w:sz w:val="17"/>
-              </w:rPr>
-              <w:br/>
-              <w:t xml:space="preserve">        FOR (pt1_idx, pt2_idx), color IN HAND_CONNECTIONS_MAP:</w:t>
-            </w:r>
-            <w:r>
-              <w:rPr>
-                <w:rFonts w:ascii="Consolas" w:hAnsi="Consolas"/>
-                <w:color w:val="1E2D3C"/>
-                <w:sz w:val="17"/>
-              </w:rPr>
-              <w:br/>
-              <w:t xml:space="preserve">            IF kpts[pt1_idx].v &gt; 0 AND kpts[pt2_idx].v &gt; 0:</w:t>
-            </w:r>
-            <w:r>
-              <w:rPr>
-                <w:rFonts w:ascii="Consolas" w:hAnsi="Consolas"/>
-                <w:color w:val="1E2D3C"/>
-                <w:sz w:val="17"/>
-              </w:rPr>
-              <w:br/>
-              <w:t xml:space="preserve">                p1 = (int(kpts[pt1_idx].x * W), int(kpts[pt1_idx].y * H))</w:t>
-            </w:r>
-            <w:r>
-              <w:rPr>
-                <w:rFonts w:ascii="Consolas" w:hAnsi="Consolas"/>
-                <w:color w:val="1E2D3C"/>
-                <w:sz w:val="17"/>
-              </w:rPr>
-              <w:br/>
-              <w:t xml:space="preserve">                p2 = (int(kpts[pt2_idx].x * W), int(kpts[pt2_idx].y * H))</w:t>
-            </w:r>
-            <w:r>
-              <w:rPr>
-                <w:rFonts w:ascii="Consolas" w:hAnsi="Consolas"/>
-                <w:color w:val="1E2D3C"/>
-                <w:sz w:val="17"/>
-              </w:rPr>
-              <w:br/>
-              <w:t xml:space="preserve">                cv2.line(img_rgb, p1, p2, color, thickness=2)</w:t>
-            </w:r>
-            <w:r>
-              <w:rPr>
-                <w:rFonts w:ascii="Consolas" w:hAnsi="Consolas"/>
-                <w:color w:val="1E2D3C"/>
-                <w:sz w:val="17"/>
-              </w:rPr>
-              <w:br/>
-            </w:r>
-            <w:r>
-              <w:rPr>
-                <w:rFonts w:ascii="Consolas" w:hAnsi="Consolas"/>
-                <w:color w:val="1E2D3C"/>
-                <w:sz w:val="17"/>
-              </w:rPr>
-              <w:br/>
-              <w:t xml:space="preserve">        # Vẽ các chấm tròn khớp xương</w:t>
-            </w:r>
-            <w:r>
-              <w:rPr>
-                <w:rFonts w:ascii="Consolas" w:hAnsi="Consolas"/>
-                <w:color w:val="1E2D3C"/>
-                <w:sz w:val="17"/>
-              </w:rPr>
-              <w:br/>
-              <w:t xml:space="preserve">        FOR kp IN kpts:</w:t>
-            </w:r>
-            <w:r>
-              <w:rPr>
-                <w:rFonts w:ascii="Consolas" w:hAnsi="Consolas"/>
-                <w:color w:val="1E2D3C"/>
-                <w:sz w:val="17"/>
-              </w:rPr>
-              <w:br/>
-              <w:t xml:space="preserve">            IF kp.v &gt; 0:</w:t>
-            </w:r>
-            <w:r>
-              <w:rPr>
-                <w:rFonts w:ascii="Consolas" w:hAnsi="Consolas"/>
-                <w:color w:val="1E2D3C"/>
-                <w:sz w:val="17"/>
-              </w:rPr>
-              <w:br/>
-            </w:r>
-            <w:r>
-              <w:rPr>
-                <w:rFonts w:ascii="Consolas" w:hAnsi="Consolas"/>
-                <w:color w:val="1E2D3C"/>
-                <w:sz w:val="17"/>
-              </w:rPr>
-              <w:lastRenderedPageBreak/>
-              <w:t xml:space="preserve">                cv2.circle(img_rgb, (int(kp.x * W), int(kp.y * H)), radius=3, color=(255, 255, 255), thickness=-1)</w:t>
-            </w:r>
-            <w:r>
-              <w:rPr>
-                <w:rFonts w:ascii="Consolas" w:hAnsi="Consolas"/>
-                <w:color w:val="1E2D3C"/>
-                <w:sz w:val="17"/>
-              </w:rPr>
-              <w:br/>
-            </w:r>
-            <w:r>
-              <w:rPr>
-                <w:rFonts w:ascii="Consolas" w:hAnsi="Consolas"/>
-                <w:color w:val="1E2D3C"/>
-                <w:sz w:val="17"/>
-              </w:rPr>
-              <w:br/>
-              <w:t xml:space="preserve">        axes[idx].imshow(img_rgb)</w:t>
-            </w:r>
-            <w:r>
-              <w:rPr>
-                <w:rFonts w:ascii="Consolas" w:hAnsi="Consolas"/>
-                <w:color w:val="1E2D3C"/>
-                <w:sz w:val="17"/>
-              </w:rPr>
-              <w:br/>
-              <w:t xml:space="preserve">        axes[idx].axis("off")</w:t>
-            </w:r>
-            <w:r>
-              <w:rPr>
-                <w:rFonts w:ascii="Consolas" w:hAnsi="Consolas"/>
-                <w:color w:val="1E2D3C"/>
-                <w:sz w:val="17"/>
-              </w:rPr>
-              <w:br/>
-            </w:r>
-            <w:r>
-              <w:rPr>
-                <w:rFonts w:ascii="Consolas" w:hAnsi="Consolas"/>
-                <w:color w:val="1E2D3C"/>
-                <w:sz w:val="17"/>
-              </w:rPr>
-              <w:br/>
-              <w:t xml:space="preserve">    plt.tight_layout()</w:t>
-            </w:r>
-            <w:r>
-              <w:rPr>
-                <w:rFonts w:ascii="Consolas" w:hAnsi="Consolas"/>
-                <w:color w:val="1E2D3C"/>
-                <w:sz w:val="17"/>
-              </w:rPr>
-              <w:br/>
-              <w:t xml:space="preserve">    plt.savefig("reports/sample_skeletons_grid.png", dpi=300)</w:t>
-            </w:r>
-          </w:p>
-        </w:tc>
-      </w:tr>
-    </w:tbl>
-    <w:p>
-      <w:pPr>
-        <w:spacing w:after="80"/>
-      </w:pPr>
-    </w:p>
-    <w:p>
-      <w:pPr>
-        <w:keepNext/>
-        <w:spacing w:before="260" w:after="80"/>
-      </w:pPr>
-      <w:r>
-        <w:rPr>
-          <w:rFonts w:ascii="Calibri" w:hAnsi="Calibri"/>
-          <w:b/>
-          <w:color w:val="124066"/>
-          <w:sz w:val="26"/>
-        </w:rPr>
-        <w:t>6. CHECKLIST THỰC THI CHO LẬP TRÌNH VIÊN &amp; TIÊU CHÍ NGHIỆM THU</w:t>
-      </w:r>
-    </w:p>
-    <w:p>
-      <w:pPr>
-        <w:keepNext/>
-        <w:spacing w:before="180" w:after="60"/>
-      </w:pPr>
-      <w:r>
-        <w:rPr>
-          <w:rFonts w:ascii="Calibri" w:hAnsi="Calibri"/>
-          <w:b/>
-          <w:color w:val="1F6EA5"/>
-        </w:rPr>
-        <w:t>Checklist từng bước triển khai:</w:t>
+        <w:t>Đồ thị mật độ KDE cho thấy giá trị cực tiểu đạt 0.0000 (hai đầu ngón tay chạm khít hoàn toàn), mốc phân vị 25% là 0.1579, và giá trị trung vị tự nhiên khi xòe tay là 0.2744.</w:t>
       </w:r>
     </w:p>
     <w:p>
@@ -4133,7 +5403,7 @@
           <w:color w:val="28323C"/>
           <w:sz w:val="19"/>
         </w:rPr>
-        <w:t>Bước 2.1: Tạo thư mục reports/figures/ bằng lệnh os.makedirs(exist_ok=True).</w:t>
+        <w:t>Thiết lập ngưỡng thực nghiệm vững chắc:</w:t>
       </w:r>
     </w:p>
     <w:p>
@@ -4147,7 +5417,7 @@
           <w:color w:val="28323C"/>
           <w:sz w:val="19"/>
         </w:rPr>
-        <w:t>Bước 2.2: Tạo tệp src/visualize_stats.py và lập trình các hàm vẽ 3 biểu đồ thống kê từ clean_metrics.json.</w:t>
+        <w:t xml:space="preserve">  - Vùng kích hoạt Zoom (Pinch Active Zone &lt;= 0.12): Khi khoảng cách d_pinch nằm trong vùng màu đỏ, hệ thống phát tín hiệu Zoom In / Zoom Out liên tục.</w:t>
       </w:r>
     </w:p>
     <w:p>
@@ -4161,7 +5431,103 @@
           <w:color w:val="28323C"/>
           <w:sz w:val="19"/>
         </w:rPr>
-        <w:t>Bước 2.3: Thực thi python src/visualize_stats.py và kiểm tra các file ảnh sinh ra trong reports/figures/.</w:t>
+        <w:t xml:space="preserve">  - Vùng thả lỏng an toàn (Neutral Zone &gt;= 0.22): Đảm bảo khi người thuyết trình mở tay tự nhiên, hệ thống không bao giờ bị kích hoạt nhầm lệnh Zoom.</w:t>
+      </w:r>
+    </w:p>
+    <w:p>
+      <w:pPr>
+        <w:spacing w:before="120" w:after="40"/>
+        <w:jc w:val="center"/>
+      </w:pPr>
+      <w:r>
+        <w:rPr>
+          <w:noProof/>
+        </w:rPr>
+        <w:drawing>
+          <wp:inline distT="0" distB="0" distL="0" distR="0" wp14:anchorId="3496FC4A" wp14:editId="1F596A71">
+            <wp:extent cx="5486400" cy="3291840"/>
+            <wp:effectExtent l="0" t="0" r="0" b="0"/>
+            <wp:docPr id="2" name="Picture 2"/>
+            <wp:cNvGraphicFramePr>
+              <a:graphicFrameLocks xmlns:a="http://schemas.openxmlformats.org/drawingml/2006/main" noChangeAspect="1"/>
+            </wp:cNvGraphicFramePr>
+            <a:graphic xmlns:a="http://schemas.openxmlformats.org/drawingml/2006/main">
+              <a:graphicData uri="http://schemas.openxmlformats.org/drawingml/2006/picture">
+                <pic:pic xmlns:pic="http://schemas.openxmlformats.org/drawingml/2006/picture">
+                  <pic:nvPicPr>
+                    <pic:cNvPr id="0" name="pinch_distance_distribution.png"/>
+                    <pic:cNvPicPr/>
+                  </pic:nvPicPr>
+                  <pic:blipFill>
+                    <a:blip r:embed="rId7"/>
+                    <a:stretch>
+                      <a:fillRect/>
+                    </a:stretch>
+                  </pic:blipFill>
+                  <pic:spPr>
+                    <a:xfrm>
+                      <a:off x="0" y="0"/>
+                      <a:ext cx="5486400" cy="3291840"/>
+                    </a:xfrm>
+                    <a:prstGeom prst="rect">
+                      <a:avLst/>
+                    </a:prstGeom>
+                  </pic:spPr>
+                </pic:pic>
+              </a:graphicData>
+            </a:graphic>
+          </wp:inline>
+        </w:drawing>
+      </w:r>
+    </w:p>
+    <w:p>
+      <w:pPr>
+        <w:spacing w:after="160"/>
+        <w:jc w:val="center"/>
+      </w:pPr>
+      <w:r>
+        <w:rPr>
+          <w:rFonts w:ascii="Calibri" w:hAnsi="Calibri"/>
+          <w:i/>
+          <w:color w:val="646E78"/>
+          <w:sz w:val="18"/>
+        </w:rPr>
+        <w:t>Hình 2: Biểu đồ phân bố khoảng cách chụm ngón P4-P8 và các mốc ngưỡng điều khiển Zoom</w:t>
+      </w:r>
+    </w:p>
+    <w:p>
+      <w:pPr>
+        <w:keepNext/>
+        <w:spacing w:before="200" w:after="60"/>
+      </w:pPr>
+      <w:r>
+        <w:rPr>
+          <w:rFonts w:ascii="Calibri" w:hAnsi="Calibri"/>
+          <w:b/>
+          <w:color w:val="1F6EA5"/>
+        </w:rPr>
+        <w:t>5</w:t>
+      </w:r>
+      <w:r>
+        <w:rPr>
+          <w:rFonts w:ascii="Calibri" w:hAnsi="Calibri"/>
+          <w:b/>
+          <w:color w:val="1F6EA5"/>
+        </w:rPr>
+        <w:t>.3. Đánh giá Biểu đồ 3: Bản đồ nhiệt mật độ không gian 2D (Spatial Heatmap)</w:t>
+      </w:r>
+    </w:p>
+    <w:p>
+      <w:pPr>
+        <w:spacing w:after="70"/>
+      </w:pPr>
+      <w:r>
+        <w:rPr>
+          <w:rFonts w:ascii="Calibri" w:hAnsi="Calibri"/>
+          <w:color w:val="28323C"/>
+          <w:sz w:val="20"/>
+        </w:rPr>
+        <w:t>Bản đồ nhiệt 2D biểu diễn vị trí không gian của khớp Cổ tay (P0) và Đỉnh ngón trỏ (P8) trên hệ tọa độ chuẩn hóa (gốc 0,0 ở góc trên bên trái):</w:t>
       </w:r>
     </w:p>
     <w:p>
@@ -4175,7 +5541,7 @@
           <w:color w:val="28323C"/>
           <w:sz w:val="19"/>
         </w:rPr>
-        <w:t>Bước 2.4: Tạo tệp src/visualize_samples.py và lập trình hàm vẽ khung xương 21 điểm nối màu lên ảnh gốc.</w:t>
+        <w:t>Mật độ phân bố cho thấy 75% cử chỉ của bàn tay tập trung mạnh mẽ trong vùng trung tâm khung hình (X in [0.25, 0.65], Y in [0.25, 0.75]).</w:t>
       </w:r>
     </w:p>
     <w:p>
@@ -4189,13 +5555,75 @@
           <w:color w:val="28323C"/>
           <w:sz w:val="19"/>
         </w:rPr>
-        <w:t>Bước 2.5: Thực thi python src/visualize_samples.py và kiểm tra tệp lưới ảnh reports/sample_skeletons_grid.png.</w:t>
+        <w:t>Khung chữ nhật nét đứt màu đỏ trên biểu đồ chính là Vùng tương tác chuột (Active Interaction Box). Khi lập trình điều khiển chuột desktop, thuật toán sẽ co tỉ lệ vùng này sang độ phân giải màn hình 1920x1080. Nhờ đó, người thuyết trình chỉ cần di chuyển ngón trỏ nhẹ nhàng trong phạm vi này là con trỏ chuột ảo đã bay khắp màn hình mà không cần với tay ra mép camera.</w:t>
+      </w:r>
+    </w:p>
+    <w:p>
+      <w:pPr>
+        <w:spacing w:before="120" w:after="40"/>
+        <w:jc w:val="center"/>
+      </w:pPr>
+      <w:r>
+        <w:rPr>
+          <w:noProof/>
+        </w:rPr>
+        <w:lastRenderedPageBreak/>
+        <w:drawing>
+          <wp:inline distT="0" distB="0" distL="0" distR="0" wp14:anchorId="4455366F" wp14:editId="141621CF">
+            <wp:extent cx="5486400" cy="2351314"/>
+            <wp:effectExtent l="0" t="0" r="0" b="0"/>
+            <wp:docPr id="3" name="Picture 3"/>
+            <wp:cNvGraphicFramePr>
+              <a:graphicFrameLocks xmlns:a="http://schemas.openxmlformats.org/drawingml/2006/main" noChangeAspect="1"/>
+            </wp:cNvGraphicFramePr>
+            <a:graphic xmlns:a="http://schemas.openxmlformats.org/drawingml/2006/main">
+              <a:graphicData uri="http://schemas.openxmlformats.org/drawingml/2006/picture">
+                <pic:pic xmlns:pic="http://schemas.openxmlformats.org/drawingml/2006/picture">
+                  <pic:nvPicPr>
+                    <pic:cNvPr id="0" name="spatial_heatmap.png"/>
+                    <pic:cNvPicPr/>
+                  </pic:nvPicPr>
+                  <pic:blipFill>
+                    <a:blip r:embed="rId8"/>
+                    <a:stretch>
+                      <a:fillRect/>
+                    </a:stretch>
+                  </pic:blipFill>
+                  <pic:spPr>
+                    <a:xfrm>
+                      <a:off x="0" y="0"/>
+                      <a:ext cx="5486400" cy="2351314"/>
+                    </a:xfrm>
+                    <a:prstGeom prst="rect">
+                      <a:avLst/>
+                    </a:prstGeom>
+                  </pic:spPr>
+                </pic:pic>
+              </a:graphicData>
+            </a:graphic>
+          </wp:inline>
+        </w:drawing>
+      </w:r>
+    </w:p>
+    <w:p>
+      <w:pPr>
+        <w:spacing w:after="160"/>
+        <w:jc w:val="center"/>
+      </w:pPr>
+      <w:r>
+        <w:rPr>
+          <w:rFonts w:ascii="Calibri" w:hAnsi="Calibri"/>
+          <w:i/>
+          <w:color w:val="646E78"/>
+          <w:sz w:val="18"/>
+        </w:rPr>
+        <w:t>Hình 3: Bản đồ nhiệt 2D vị trí Cổ tay (trái) và Đỉnh ngón trỏ kèm Vùng tương tác Active Box (phải)</w:t>
       </w:r>
     </w:p>
     <w:p>
       <w:pPr>
         <w:keepNext/>
-        <w:spacing w:before="180" w:after="60"/>
+        <w:spacing w:before="200" w:after="60"/>
       </w:pPr>
       <w:r>
         <w:rPr>
@@ -4203,7 +5631,28 @@
           <w:b/>
           <w:color w:val="1F6EA5"/>
         </w:rPr>
-        <w:t>Tiêu chí nghiệm thu hoàn thành Bước 2 (Definition of Done):</w:t>
+        <w:t>5</w:t>
+      </w:r>
+      <w:r>
+        <w:rPr>
+          <w:rFonts w:ascii="Calibri" w:hAnsi="Calibri"/>
+          <w:b/>
+          <w:color w:val="1F6EA5"/>
+        </w:rPr>
+        <w:t>.4. Đánh giá Biểu đồ 4: Phân bố Hướng Nghiêng Ngang (Swipe Directional Span)</w:t>
+      </w:r>
+    </w:p>
+    <w:p>
+      <w:pPr>
+        <w:spacing w:after="70"/>
+      </w:pPr>
+      <w:r>
+        <w:rPr>
+          <w:rFonts w:ascii="Calibri" w:hAnsi="Calibri"/>
+          <w:color w:val="28323C"/>
+          <w:sz w:val="20"/>
+        </w:rPr>
+        <w:t>Khác với Zoom và Con trỏ, thao tác Vuốt tiến / lùi slide là cử chỉ động lực học theo thời gian. Biểu đồ độ lệch ngang Delta X = Index_X - Wrist_X phản ánh độ vung và góc nghiêng của bàn tay sang hai bên:</w:t>
       </w:r>
     </w:p>
     <w:p>
@@ -4217,7 +5666,7 @@
           <w:color w:val="28323C"/>
           <w:sz w:val="19"/>
         </w:rPr>
-        <w:t>Có đầy đủ 3 biểu đồ phân bố chất lượng cao (box_distribution.png, pinch_distance_distribution.png, spatial_heatmap.png).</w:t>
+        <w:t>Trục trung hòa (Delta X = 0): Bàn tay ở tư thế thẳng đứng nghỉ ngơi.</w:t>
       </w:r>
     </w:p>
     <w:p>
@@ -4231,7 +5680,7 @@
           <w:color w:val="28323C"/>
           <w:sz w:val="19"/>
         </w:rPr>
-        <w:t>Có tệp lưới ảnh sample_skeletons_grid.png hiển thị rõ ràng các khớp ngón tay có màu sắc phân biệt.</w:t>
+        <w:t>Vùng hướng Tiến (Next Slide: Delta X &gt;= +0.15): Bàn tay nghiêng dứt khoát về bên Phải, kết hợp vận tốc ngang vx &gt; 0 để kích hoạt lật sang slide tiếp theo.</w:t>
       </w:r>
     </w:p>
     <w:p>
@@ -4245,8 +5694,80 @@
           <w:color w:val="28323C"/>
           <w:sz w:val="19"/>
         </w:rPr>
-        <w:t>Các ngưỡng Zoom, Con trỏ và Vuốt được chứng minh nhất quán bằng hình ảnh đồ thị.</w:t>
+        <w:t>Vùng hướng Lùi (Prev Slide: Delta X &lt;= -0.15): Bàn tay nghiêng dứt khoát về bên Trái, kết hợp vận tốc ngang vx &lt; 0 để kích hoạt quay lại slide trước.</w:t>
       </w:r>
+    </w:p>
+    <w:p>
+      <w:pPr>
+        <w:spacing w:before="120" w:after="40"/>
+        <w:jc w:val="center"/>
+      </w:pPr>
+      <w:r>
+        <w:rPr>
+          <w:noProof/>
+        </w:rPr>
+        <w:drawing>
+          <wp:inline distT="0" distB="0" distL="0" distR="0" wp14:anchorId="301BC1BD" wp14:editId="33E44AB3">
+            <wp:extent cx="5486400" cy="3291840"/>
+            <wp:effectExtent l="0" t="0" r="0" b="0"/>
+            <wp:docPr id="4" name="Picture 4"/>
+            <wp:cNvGraphicFramePr>
+              <a:graphicFrameLocks xmlns:a="http://schemas.openxmlformats.org/drawingml/2006/main" noChangeAspect="1"/>
+            </wp:cNvGraphicFramePr>
+            <a:graphic xmlns:a="http://schemas.openxmlformats.org/drawingml/2006/main">
+              <a:graphicData uri="http://schemas.openxmlformats.org/drawingml/2006/picture">
+                <pic:pic xmlns:pic="http://schemas.openxmlformats.org/drawingml/2006/picture">
+                  <pic:nvPicPr>
+                    <pic:cNvPr id="0" name="swipe_span_distribution.png"/>
+                    <pic:cNvPicPr/>
+                  </pic:nvPicPr>
+                  <pic:blipFill>
+                    <a:blip r:embed="rId9"/>
+                    <a:stretch>
+                      <a:fillRect/>
+                    </a:stretch>
+                  </pic:blipFill>
+                  <pic:spPr>
+                    <a:xfrm>
+                      <a:off x="0" y="0"/>
+                      <a:ext cx="5486400" cy="3291840"/>
+                    </a:xfrm>
+                    <a:prstGeom prst="rect">
+                      <a:avLst/>
+                    </a:prstGeom>
+                  </pic:spPr>
+                </pic:pic>
+              </a:graphicData>
+            </a:graphic>
+          </wp:inline>
+        </w:drawing>
+      </w:r>
+    </w:p>
+    <w:p>
+      <w:pPr>
+        <w:spacing w:after="160"/>
+        <w:jc w:val="center"/>
+      </w:pPr>
+      <w:r>
+        <w:rPr>
+          <w:rFonts w:ascii="Calibri" w:hAnsi="Calibri"/>
+          <w:i/>
+          <w:color w:val="646E78"/>
+          <w:sz w:val="18"/>
+        </w:rPr>
+        <w:t>Hình 4: Biểu đồ phân bố độ lệch ngang phục vụ nhận diện hướng Vuốt lật slide</w:t>
+      </w:r>
+    </w:p>
+    <w:p>
+      <w:pPr>
+        <w:pStyle w:val="ListBullet"/>
+        <w:numPr>
+          <w:ilvl w:val="0"/>
+          <w:numId w:val="0"/>
+        </w:numPr>
+        <w:spacing w:after="50"/>
+        <w:ind w:left="360" w:hanging="360"/>
+      </w:pPr>
     </w:p>
     <w:sectPr>
       <w:pgSz w:w="12240" w:h="15840"/>
@@ -4413,7 +5934,7 @@
   <w:abstractNum w:abstractNumId="8" w15:restartNumberingAfterBreak="0">
     <w:nsid w:val="FFFFFF89"/>
     <w:multiLevelType w:val="singleLevel"/>
-    <w:tmpl w:val="29761A62"/>
+    <w:tmpl w:val="1D0A62EA"/>
     <w:lvl w:ilvl="0">
       <w:start w:val="1"/>
       <w:numFmt w:val="bullet"/>
@@ -4431,31 +5952,31 @@
       </w:rPr>
     </w:lvl>
   </w:abstractNum>
-  <w:num w:numId="1" w16cid:durableId="713118295">
+  <w:num w:numId="1" w16cid:durableId="419835557">
     <w:abstractNumId w:val="8"/>
   </w:num>
-  <w:num w:numId="2" w16cid:durableId="2075156550">
+  <w:num w:numId="2" w16cid:durableId="1412845971">
     <w:abstractNumId w:val="6"/>
   </w:num>
-  <w:num w:numId="3" w16cid:durableId="262302152">
+  <w:num w:numId="3" w16cid:durableId="829566522">
     <w:abstractNumId w:val="5"/>
   </w:num>
-  <w:num w:numId="4" w16cid:durableId="441196022">
+  <w:num w:numId="4" w16cid:durableId="1986085363">
     <w:abstractNumId w:val="4"/>
   </w:num>
-  <w:num w:numId="5" w16cid:durableId="1429080337">
+  <w:num w:numId="5" w16cid:durableId="1336954261">
     <w:abstractNumId w:val="7"/>
   </w:num>
-  <w:num w:numId="6" w16cid:durableId="1115246567">
+  <w:num w:numId="6" w16cid:durableId="1421410474">
     <w:abstractNumId w:val="3"/>
   </w:num>
-  <w:num w:numId="7" w16cid:durableId="589696870">
+  <w:num w:numId="7" w16cid:durableId="2025549290">
     <w:abstractNumId w:val="2"/>
   </w:num>
-  <w:num w:numId="8" w16cid:durableId="896088202">
+  <w:num w:numId="8" w16cid:durableId="404374230">
     <w:abstractNumId w:val="1"/>
   </w:num>
-  <w:num w:numId="9" w16cid:durableId="332756870">
+  <w:num w:numId="9" w16cid:durableId="1186333081">
     <w:abstractNumId w:val="0"/>
   </w:num>
 </w:numbering>

</xml_diff>